<commit_message>
Fit paper to 6 pages; three-phase waveform figure; explicit ratio definition
Co-Authored-By: Claude Opus 5.5 <noreply@anthropic.com>
Claude-Session: https://claude.ai/code/session_019mQSSZrr74cbeDdr3V2xBg
</commit_message>
<xml_diff>
--- a/ncue-pv-inverter-uncertainty/paper_rev/CSME2026_Govino_revised.docx
+++ b/ncue-pv-inverter-uncertainty/paper_rev/CSME2026_Govino_revised.docx
@@ -192,7 +192,7 @@
           <w:sz w:val="20"/>
           <w:szCs w:val="20"/>
         </w:rPr>
-        <w:t xml:space="preserve">When no verified power measurements are available, the energy output of a rooftop PV system can be estimated from the technical specifications of its modules and from public weather data. The pvlib Python library provides the main building blocks for such modeling [1], [2], but the results depend on the assumptions made at each step. One of them concerns the inverter. A constant efficiency with clipping is the simplest baseline, while PVWatts [3] accounts for the variation of efficiency with load. The Sandia [4] and ADR [5] models need inverter performance data that manufacturer datasheets do not always give. Data resolution is a further issue: hourly weather data average out short periods of high irradiance, so the model underestimates inverter clipping [6].</w:t>
+        <w:t xml:space="preserve">When no verified power measurements are available, the energy output of a rooftop PV system can be estimated from the technical specifications of its modules and from public weather data. The pvlib Python library provides the main building blocks for such modeling [1], [2], but the results depend on the assumptions made at each step. One of them concerns the inverter. A constant efficiency with clipping is the simplest baseline, while PVWatts [3] accounts for the variation of efficiency with load. The Sandia [4] and ADR [5] models need inverter performance data that manufacturer datasheets do not always give. Hourly weather data also underestimate inverter clipping [6].</w:t>
       </w:r>
     </w:p>
     <w:p>
@@ -310,7 +310,7 @@
       <w:r>
         <w:drawing>
           <wp:inline distT="0" distB="0" distL="0" distR="0">
-            <wp:extent cx="5762625" cy="2924175"/>
+            <wp:extent cx="5486400" cy="2781300"/>
             <wp:effectExtent t="0" r="0" b="0" l="0"/>
             <wp:docPr id="1" name="fig1_layout.png" descr="Plant layout: roof blocks, strings, inverters and Hioki measurement point" title="Plant layout: roof blocks, strings, inverters and Hioki measurement point"/>
             <wp:cNvGraphicFramePr>
@@ -335,7 +335,7 @@
                   <pic:spPr bwMode="auto">
                     <a:xfrm>
                       <a:off x="0" y="0"/>
-                      <a:ext cx="5762625" cy="2924175"/>
+                      <a:ext cx="5486400" cy="2781300"/>
                     </a:xfrm>
                     <a:prstGeom prst="rect">
                       <a:avLst/>
@@ -1012,7 +1012,7 @@
           <w:sz w:val="20"/>
           <w:szCs w:val="20"/>
         </w:rPr>
-        <w:t xml:space="preserve">The AC power at the common output of the three inverters was recorded with a Hioki MR8875 [18] (Fig. 1b, Fig. 2a). Three clamp sensors measure the line currents </w:t>
+        <w:t xml:space="preserve">The AC power at the common output of the three inverters was recorded with a Hioki MR8875 [18] (Fig. 1b). Three clamps measure the line currents </w:t>
       </w:r>
       <w:r>
         <w:rPr>
@@ -1093,7 +1093,7 @@
           <w:sz w:val="20"/>
           <w:szCs w:val="20"/>
         </w:rPr>
-        <w:t xml:space="preserve">, and three voltage channels measure the line-to-line voltages </w:t>
+        <w:t xml:space="preserve">, and three channels the line-to-line voltages </w:t>
       </w:r>
       <w:r>
         <w:rPr>
@@ -1174,88 +1174,7 @@
           <w:sz w:val="20"/>
           <w:szCs w:val="20"/>
         </w:rPr>
-        <w:t xml:space="preserve">. The system has three wires and no neutral, so </w:t>
-      </w:r>
-      <w:r>
-        <w:rPr>
-          <w:rFonts w:ascii="Times New Roman" w:cs="Times New Roman" w:eastAsia="Times New Roman" w:hAnsi="Times New Roman"/>
-          <w:i/>
-          <w:iCs/>
-          <w:sz w:val="20"/>
-          <w:szCs w:val="20"/>
-        </w:rPr>
-        <w:t xml:space="preserve">i</w:t>
-      </w:r>
-      <w:r>
-        <w:rPr>
-          <w:rFonts w:ascii="Times New Roman" w:cs="Times New Roman" w:eastAsia="Times New Roman" w:hAnsi="Times New Roman"/>
-          <w:sz w:val="20"/>
-          <w:szCs w:val="20"/>
-          <w:vertAlign w:val="subscript"/>
-        </w:rPr>
-        <w:t xml:space="preserve">a</w:t>
-      </w:r>
-      <w:r>
-        <w:rPr>
-          <w:rFonts w:ascii="Times New Roman" w:cs="Times New Roman" w:eastAsia="Times New Roman" w:hAnsi="Times New Roman"/>
-          <w:sz w:val="20"/>
-          <w:szCs w:val="20"/>
-        </w:rPr>
-        <w:t xml:space="preserve"> + </w:t>
-      </w:r>
-      <w:r>
-        <w:rPr>
-          <w:rFonts w:ascii="Times New Roman" w:cs="Times New Roman" w:eastAsia="Times New Roman" w:hAnsi="Times New Roman"/>
-          <w:i/>
-          <w:iCs/>
-          <w:sz w:val="20"/>
-          <w:szCs w:val="20"/>
-        </w:rPr>
-        <w:t xml:space="preserve">i</w:t>
-      </w:r>
-      <w:r>
-        <w:rPr>
-          <w:rFonts w:ascii="Times New Roman" w:cs="Times New Roman" w:eastAsia="Times New Roman" w:hAnsi="Times New Roman"/>
-          <w:sz w:val="20"/>
-          <w:szCs w:val="20"/>
-          <w:vertAlign w:val="subscript"/>
-        </w:rPr>
-        <w:t xml:space="preserve">b</w:t>
-      </w:r>
-      <w:r>
-        <w:rPr>
-          <w:rFonts w:ascii="Times New Roman" w:cs="Times New Roman" w:eastAsia="Times New Roman" w:hAnsi="Times New Roman"/>
-          <w:sz w:val="20"/>
-          <w:szCs w:val="20"/>
-        </w:rPr>
-        <w:t xml:space="preserve"> + </w:t>
-      </w:r>
-      <w:r>
-        <w:rPr>
-          <w:rFonts w:ascii="Times New Roman" w:cs="Times New Roman" w:eastAsia="Times New Roman" w:hAnsi="Times New Roman"/>
-          <w:i/>
-          <w:iCs/>
-          <w:sz w:val="20"/>
-          <w:szCs w:val="20"/>
-        </w:rPr>
-        <w:t xml:space="preserve">i</w:t>
-      </w:r>
-      <w:r>
-        <w:rPr>
-          <w:rFonts w:ascii="Times New Roman" w:cs="Times New Roman" w:eastAsia="Times New Roman" w:hAnsi="Times New Roman"/>
-          <w:sz w:val="20"/>
-          <w:szCs w:val="20"/>
-          <w:vertAlign w:val="subscript"/>
-        </w:rPr>
-        <w:t xml:space="preserve">c</w:t>
-      </w:r>
-      <w:r>
-        <w:rPr>
-          <w:rFonts w:ascii="Times New Roman" w:cs="Times New Roman" w:eastAsia="Times New Roman" w:hAnsi="Times New Roman"/>
-          <w:sz w:val="20"/>
-          <w:szCs w:val="20"/>
-        </w:rPr>
-        <w:t xml:space="preserve"> = 0 and the active power follows from two products (two-wattmeter or Aron method, valid for unbalanced and distorted waveforms [28]):</w:t>
+        <w:t xml:space="preserve">. Fig. 2 shows the three phase voltages of the bus: equal amplitude, displaced by 120°, 221 V rms per phase (313 V peak) and 383 V rms between lines. For balanced sinusoidal quantities the active power follows from the rms values,</w:t>
       </w:r>
     </w:p>
     <w:p>
@@ -1290,7 +1209,7 @@
           <w:sz w:val="20"/>
           <w:szCs w:val="20"/>
         </w:rPr>
-        <w:t xml:space="preserve"> = ⟨</w:t>
+        <w:t xml:space="preserve"> = √3 </w:t>
       </w:r>
       <w:r>
         <w:rPr>
@@ -1300,7 +1219,7 @@
           <w:sz w:val="20"/>
           <w:szCs w:val="20"/>
         </w:rPr>
-        <w:t xml:space="preserve">v</w:t>
+        <w:t xml:space="preserve">V</w:t>
       </w:r>
       <w:r>
         <w:rPr>
@@ -1309,7 +1228,7 @@
           <w:szCs w:val="20"/>
           <w:vertAlign w:val="subscript"/>
         </w:rPr>
-        <w:t xml:space="preserve">ab</w:t>
+        <w:t xml:space="preserve">LL</w:t>
       </w:r>
       <w:r>
         <w:rPr>
@@ -1327,7 +1246,7 @@
           <w:sz w:val="20"/>
           <w:szCs w:val="20"/>
         </w:rPr>
-        <w:t xml:space="preserve">i</w:t>
+        <w:t xml:space="preserve">I</w:t>
       </w:r>
       <w:r>
         <w:rPr>
@@ -1336,69 +1255,15 @@
           <w:szCs w:val="20"/>
           <w:vertAlign w:val="subscript"/>
         </w:rPr>
-        <w:t xml:space="preserve">a</w:t>
-      </w:r>
-      <w:r>
-        <w:rPr>
-          <w:rFonts w:ascii="Times New Roman" w:cs="Times New Roman" w:eastAsia="Times New Roman" w:hAnsi="Times New Roman"/>
-          <w:sz w:val="20"/>
-          <w:szCs w:val="20"/>
-        </w:rPr>
-        <w:t xml:space="preserve"> − </w:t>
-      </w:r>
-      <w:r>
-        <w:rPr>
-          <w:rFonts w:ascii="Times New Roman" w:cs="Times New Roman" w:eastAsia="Times New Roman" w:hAnsi="Times New Roman"/>
-          <w:i/>
-          <w:iCs/>
-          <w:sz w:val="20"/>
-          <w:szCs w:val="20"/>
-        </w:rPr>
-        <w:t xml:space="preserve">v</w:t>
-      </w:r>
-      <w:r>
-        <w:rPr>
-          <w:rFonts w:ascii="Times New Roman" w:cs="Times New Roman" w:eastAsia="Times New Roman" w:hAnsi="Times New Roman"/>
-          <w:sz w:val="20"/>
-          <w:szCs w:val="20"/>
-          <w:vertAlign w:val="subscript"/>
-        </w:rPr>
-        <w:t xml:space="preserve">bc</w:t>
-      </w:r>
-      <w:r>
-        <w:rPr>
-          <w:rFonts w:ascii="Times New Roman" w:cs="Times New Roman" w:eastAsia="Times New Roman" w:hAnsi="Times New Roman"/>
-          <w:sz w:val="20"/>
-          <w:szCs w:val="20"/>
-        </w:rPr>
-        <w:t xml:space="preserve"> </w:t>
-      </w:r>
-      <w:r>
-        <w:rPr>
-          <w:rFonts w:ascii="Times New Roman" w:cs="Times New Roman" w:eastAsia="Times New Roman" w:hAnsi="Times New Roman"/>
-          <w:i/>
-          <w:iCs/>
-          <w:sz w:val="20"/>
-          <w:szCs w:val="20"/>
-        </w:rPr>
-        <w:t xml:space="preserve">i</w:t>
-      </w:r>
-      <w:r>
-        <w:rPr>
-          <w:rFonts w:ascii="Times New Roman" w:cs="Times New Roman" w:eastAsia="Times New Roman" w:hAnsi="Times New Roman"/>
-          <w:sz w:val="20"/>
-          <w:szCs w:val="20"/>
-          <w:vertAlign w:val="subscript"/>
-        </w:rPr>
-        <w:t xml:space="preserve">c</w:t>
-      </w:r>
-      <w:r>
-        <w:rPr>
-          <w:rFonts w:ascii="Times New Roman" w:cs="Times New Roman" w:eastAsia="Times New Roman" w:hAnsi="Times New Roman"/>
-          <w:sz w:val="20"/>
-          <w:szCs w:val="20"/>
-        </w:rPr>
-        <w:t xml:space="preserve">⟩</w:t>
+        <w:t xml:space="preserve">L</w:t>
+      </w:r>
+      <w:r>
+        <w:rPr>
+          <w:rFonts w:ascii="Times New Roman" w:cs="Times New Roman" w:eastAsia="Times New Roman" w:hAnsi="Times New Roman"/>
+          <w:sz w:val="20"/>
+          <w:szCs w:val="20"/>
+        </w:rPr>
+        <w:t xml:space="preserve"> cos φ</w:t>
       </w:r>
       <w:r>
         <w:rPr>
@@ -1421,7 +1286,7 @@
           <w:sz w:val="20"/>
           <w:szCs w:val="20"/>
         </w:rPr>
-        <w:t xml:space="preserve">The three cyclic forms of Eq. (1) agree within 1%. Fig. 2b shows why line-to-line voltages must not be multiplied with the current of the same channel: </w:t>
+        <w:t xml:space="preserve">where φ is the angle between phase voltage and current. The recorder samples the waveforms, and because the system has three wires and no neutral (</w:t>
       </w:r>
       <w:r>
         <w:rPr>
@@ -1431,7 +1296,7 @@
           <w:sz w:val="20"/>
           <w:szCs w:val="20"/>
         </w:rPr>
-        <w:t xml:space="preserve">V</w:t>
+        <w:t xml:space="preserve">i</w:t>
       </w:r>
       <w:r>
         <w:rPr>
@@ -1440,15 +1305,15 @@
           <w:szCs w:val="20"/>
           <w:vertAlign w:val="subscript"/>
         </w:rPr>
-        <w:t xml:space="preserve">ab</w:t>
-      </w:r>
-      <w:r>
-        <w:rPr>
-          <w:rFonts w:ascii="Times New Roman" w:cs="Times New Roman" w:eastAsia="Times New Roman" w:hAnsi="Times New Roman"/>
-          <w:sz w:val="20"/>
-          <w:szCs w:val="20"/>
-        </w:rPr>
-        <w:t xml:space="preserve"> leads </w:t>
+        <w:t xml:space="preserve">a</w:t>
+      </w:r>
+      <w:r>
+        <w:rPr>
+          <w:rFonts w:ascii="Times New Roman" w:cs="Times New Roman" w:eastAsia="Times New Roman" w:hAnsi="Times New Roman"/>
+          <w:sz w:val="20"/>
+          <w:szCs w:val="20"/>
+        </w:rPr>
+        <w:t xml:space="preserve"> + </w:t>
       </w:r>
       <w:r>
         <w:rPr>
@@ -1458,7 +1323,7 @@
           <w:sz w:val="20"/>
           <w:szCs w:val="20"/>
         </w:rPr>
-        <w:t xml:space="preserve">I</w:t>
+        <w:t xml:space="preserve">i</w:t>
       </w:r>
       <w:r>
         <w:rPr>
@@ -1467,15 +1332,15 @@
           <w:szCs w:val="20"/>
           <w:vertAlign w:val="subscript"/>
         </w:rPr>
-        <w:t xml:space="preserve">a</w:t>
-      </w:r>
-      <w:r>
-        <w:rPr>
-          <w:rFonts w:ascii="Times New Roman" w:cs="Times New Roman" w:eastAsia="Times New Roman" w:hAnsi="Times New Roman"/>
-          <w:sz w:val="20"/>
-          <w:szCs w:val="20"/>
-        </w:rPr>
-        <w:t xml:space="preserve"> by 30° + φ, so the sum of the three products gives 3</w:t>
+        <w:t xml:space="preserve">b</w:t>
+      </w:r>
+      <w:r>
+        <w:rPr>
+          <w:rFonts w:ascii="Times New Roman" w:cs="Times New Roman" w:eastAsia="Times New Roman" w:hAnsi="Times New Roman"/>
+          <w:sz w:val="20"/>
+          <w:szCs w:val="20"/>
+        </w:rPr>
+        <w:t xml:space="preserve"> + </w:t>
       </w:r>
       <w:r>
         <w:rPr>
@@ -1485,7 +1350,7 @@
           <w:sz w:val="20"/>
           <w:szCs w:val="20"/>
         </w:rPr>
-        <w:t xml:space="preserve">V</w:t>
+        <w:t xml:space="preserve">i</w:t>
       </w:r>
       <w:r>
         <w:rPr>
@@ -1494,7 +1359,32 @@
           <w:szCs w:val="20"/>
           <w:vertAlign w:val="subscript"/>
         </w:rPr>
-        <w:t xml:space="preserve">LL</w:t>
+        <w:t xml:space="preserve">c</w:t>
+      </w:r>
+      <w:r>
+        <w:rPr>
+          <w:rFonts w:ascii="Times New Roman" w:cs="Times New Roman" w:eastAsia="Times New Roman" w:hAnsi="Times New Roman"/>
+          <w:sz w:val="20"/>
+          <w:szCs w:val="20"/>
+        </w:rPr>
+        <w:t xml:space="preserve"> = 0), the instantaneous power follows from two products (two-wattmeter or Aron method), which remains valid for unbalanced and distorted waveforms [28]:</w:t>
+      </w:r>
+    </w:p>
+    <w:p>
+      <w:pPr>
+        <w:tabs>
+          <w:tab w:val="center" w:pos="2183"/>
+          <w:tab w:val="right" w:pos="4365"/>
+        </w:tabs>
+        <w:spacing w:after="60" w:before="60"/>
+      </w:pPr>
+      <w:r>
+        <w:rPr>
+          <w:rFonts w:ascii="Times New Roman" w:cs="Times New Roman" w:eastAsia="Times New Roman" w:hAnsi="Times New Roman"/>
+          <w:sz w:val="20"/>
+          <w:szCs w:val="20"/>
+        </w:rPr>
+        <w:t xml:space="preserve">	</w:t>
       </w:r>
       <w:r>
         <w:rPr>
@@ -1504,15 +1394,200 @@
           <w:sz w:val="20"/>
           <w:szCs w:val="20"/>
         </w:rPr>
-        <w:t xml:space="preserve">I</w:t>
-      </w:r>
-      <w:r>
-        <w:rPr>
-          <w:rFonts w:ascii="Times New Roman" w:cs="Times New Roman" w:eastAsia="Times New Roman" w:hAnsi="Times New Roman"/>
-          <w:sz w:val="20"/>
-          <w:szCs w:val="20"/>
-        </w:rPr>
-        <w:t xml:space="preserve"> cos 30°, about 1.5 times the true power.</w:t>
+        <w:t xml:space="preserve">P</w:t>
+      </w:r>
+      <w:r>
+        <w:rPr>
+          <w:rFonts w:ascii="Times New Roman" w:cs="Times New Roman" w:eastAsia="Times New Roman" w:hAnsi="Times New Roman"/>
+          <w:sz w:val="20"/>
+          <w:szCs w:val="20"/>
+        </w:rPr>
+        <w:t xml:space="preserve"> = ⟨</w:t>
+      </w:r>
+      <w:r>
+        <w:rPr>
+          <w:rFonts w:ascii="Times New Roman" w:cs="Times New Roman" w:eastAsia="Times New Roman" w:hAnsi="Times New Roman"/>
+          <w:i/>
+          <w:iCs/>
+          <w:sz w:val="20"/>
+          <w:szCs w:val="20"/>
+        </w:rPr>
+        <w:t xml:space="preserve">v</w:t>
+      </w:r>
+      <w:r>
+        <w:rPr>
+          <w:rFonts w:ascii="Times New Roman" w:cs="Times New Roman" w:eastAsia="Times New Roman" w:hAnsi="Times New Roman"/>
+          <w:sz w:val="20"/>
+          <w:szCs w:val="20"/>
+          <w:vertAlign w:val="subscript"/>
+        </w:rPr>
+        <w:t xml:space="preserve">ab</w:t>
+      </w:r>
+      <w:r>
+        <w:rPr>
+          <w:rFonts w:ascii="Times New Roman" w:cs="Times New Roman" w:eastAsia="Times New Roman" w:hAnsi="Times New Roman"/>
+          <w:sz w:val="20"/>
+          <w:szCs w:val="20"/>
+        </w:rPr>
+        <w:t xml:space="preserve"> </w:t>
+      </w:r>
+      <w:r>
+        <w:rPr>
+          <w:rFonts w:ascii="Times New Roman" w:cs="Times New Roman" w:eastAsia="Times New Roman" w:hAnsi="Times New Roman"/>
+          <w:i/>
+          <w:iCs/>
+          <w:sz w:val="20"/>
+          <w:szCs w:val="20"/>
+        </w:rPr>
+        <w:t xml:space="preserve">i</w:t>
+      </w:r>
+      <w:r>
+        <w:rPr>
+          <w:rFonts w:ascii="Times New Roman" w:cs="Times New Roman" w:eastAsia="Times New Roman" w:hAnsi="Times New Roman"/>
+          <w:sz w:val="20"/>
+          <w:szCs w:val="20"/>
+          <w:vertAlign w:val="subscript"/>
+        </w:rPr>
+        <w:t xml:space="preserve">a</w:t>
+      </w:r>
+      <w:r>
+        <w:rPr>
+          <w:rFonts w:ascii="Times New Roman" w:cs="Times New Roman" w:eastAsia="Times New Roman" w:hAnsi="Times New Roman"/>
+          <w:sz w:val="20"/>
+          <w:szCs w:val="20"/>
+        </w:rPr>
+        <w:t xml:space="preserve"> − </w:t>
+      </w:r>
+      <w:r>
+        <w:rPr>
+          <w:rFonts w:ascii="Times New Roman" w:cs="Times New Roman" w:eastAsia="Times New Roman" w:hAnsi="Times New Roman"/>
+          <w:i/>
+          <w:iCs/>
+          <w:sz w:val="20"/>
+          <w:szCs w:val="20"/>
+        </w:rPr>
+        <w:t xml:space="preserve">v</w:t>
+      </w:r>
+      <w:r>
+        <w:rPr>
+          <w:rFonts w:ascii="Times New Roman" w:cs="Times New Roman" w:eastAsia="Times New Roman" w:hAnsi="Times New Roman"/>
+          <w:sz w:val="20"/>
+          <w:szCs w:val="20"/>
+          <w:vertAlign w:val="subscript"/>
+        </w:rPr>
+        <w:t xml:space="preserve">bc</w:t>
+      </w:r>
+      <w:r>
+        <w:rPr>
+          <w:rFonts w:ascii="Times New Roman" w:cs="Times New Roman" w:eastAsia="Times New Roman" w:hAnsi="Times New Roman"/>
+          <w:sz w:val="20"/>
+          <w:szCs w:val="20"/>
+        </w:rPr>
+        <w:t xml:space="preserve"> </w:t>
+      </w:r>
+      <w:r>
+        <w:rPr>
+          <w:rFonts w:ascii="Times New Roman" w:cs="Times New Roman" w:eastAsia="Times New Roman" w:hAnsi="Times New Roman"/>
+          <w:i/>
+          <w:iCs/>
+          <w:sz w:val="20"/>
+          <w:szCs w:val="20"/>
+        </w:rPr>
+        <w:t xml:space="preserve">i</w:t>
+      </w:r>
+      <w:r>
+        <w:rPr>
+          <w:rFonts w:ascii="Times New Roman" w:cs="Times New Roman" w:eastAsia="Times New Roman" w:hAnsi="Times New Roman"/>
+          <w:sz w:val="20"/>
+          <w:szCs w:val="20"/>
+          <w:vertAlign w:val="subscript"/>
+        </w:rPr>
+        <w:t xml:space="preserve">c</w:t>
+      </w:r>
+      <w:r>
+        <w:rPr>
+          <w:rFonts w:ascii="Times New Roman" w:cs="Times New Roman" w:eastAsia="Times New Roman" w:hAnsi="Times New Roman"/>
+          <w:sz w:val="20"/>
+          <w:szCs w:val="20"/>
+        </w:rPr>
+        <w:t xml:space="preserve">⟩</w:t>
+      </w:r>
+      <w:r>
+        <w:rPr>
+          <w:rFonts w:ascii="Times New Roman" w:cs="Times New Roman" w:eastAsia="Times New Roman" w:hAnsi="Times New Roman"/>
+          <w:sz w:val="20"/>
+          <w:szCs w:val="20"/>
+        </w:rPr>
+        <w:t xml:space="preserve">	(2)</w:t>
+      </w:r>
+    </w:p>
+    <w:p>
+      <w:pPr>
+        <w:spacing w:after="0" w:before="0" w:line="240"/>
+        <w:ind w:firstLine="400"/>
+        <w:jc w:val="both"/>
+      </w:pPr>
+      <w:r>
+        <w:rPr>
+          <w:rFonts w:ascii="Times New Roman" w:cs="Times New Roman" w:eastAsia="Times New Roman" w:hAnsi="Times New Roman"/>
+          <w:sz w:val="20"/>
+          <w:szCs w:val="20"/>
+        </w:rPr>
+        <w:t xml:space="preserve">The three cyclic forms of Eq. (2) agree within 1%. Multiplying each line current by the line-to-line voltage of its own channel would give about 1.5 times the true power, because </w:t>
+      </w:r>
+      <w:r>
+        <w:rPr>
+          <w:rFonts w:ascii="Times New Roman" w:cs="Times New Roman" w:eastAsia="Times New Roman" w:hAnsi="Times New Roman"/>
+          <w:i/>
+          <w:iCs/>
+          <w:sz w:val="20"/>
+          <w:szCs w:val="20"/>
+        </w:rPr>
+        <w:t xml:space="preserve">v</w:t>
+      </w:r>
+      <w:r>
+        <w:rPr>
+          <w:rFonts w:ascii="Times New Roman" w:cs="Times New Roman" w:eastAsia="Times New Roman" w:hAnsi="Times New Roman"/>
+          <w:sz w:val="20"/>
+          <w:szCs w:val="20"/>
+          <w:vertAlign w:val="subscript"/>
+        </w:rPr>
+        <w:t xml:space="preserve">ab</w:t>
+      </w:r>
+      <w:r>
+        <w:rPr>
+          <w:rFonts w:ascii="Times New Roman" w:cs="Times New Roman" w:eastAsia="Times New Roman" w:hAnsi="Times New Roman"/>
+          <w:sz w:val="20"/>
+          <w:szCs w:val="20"/>
+        </w:rPr>
+        <w:t xml:space="preserve"> leads </w:t>
+      </w:r>
+      <w:r>
+        <w:rPr>
+          <w:rFonts w:ascii="Times New Roman" w:cs="Times New Roman" w:eastAsia="Times New Roman" w:hAnsi="Times New Roman"/>
+          <w:i/>
+          <w:iCs/>
+          <w:sz w:val="20"/>
+          <w:szCs w:val="20"/>
+        </w:rPr>
+        <w:t xml:space="preserve">i</w:t>
+      </w:r>
+      <w:r>
+        <w:rPr>
+          <w:rFonts w:ascii="Times New Roman" w:cs="Times New Roman" w:eastAsia="Times New Roman" w:hAnsi="Times New Roman"/>
+          <w:sz w:val="20"/>
+          <w:szCs w:val="20"/>
+          <w:vertAlign w:val="subscript"/>
+        </w:rPr>
+        <w:t xml:space="preserve">a</w:t>
+      </w:r>
+      <w:r>
+        <w:rPr>
+          <w:rFonts w:ascii="Times New Roman" w:cs="Times New Roman" w:eastAsia="Times New Roman" w:hAnsi="Times New Roman"/>
+          <w:sz w:val="20"/>
+          <w:szCs w:val="20"/>
+        </w:rPr>
+        <w:t xml:space="preserve"> by 30°. The records confirm the picture of Fig. 2: the line-to-line voltages are 120° apart within ±1.5°, the currents lag the phase voltages by 0.5° to 4.3°, and the voltage and current unbalance average 0.9% (maxima 3.8% and 3.6%). Eq. (1) applied to the fundamental components agrees with Eq. (2) to a median of −0.13%, and the daytime power factor is 0.995.</w:t>
       </w:r>
     </w:p>
     <w:p>
@@ -1524,9 +1599,9 @@
       <w:r>
         <w:drawing>
           <wp:inline distT="0" distB="0" distL="0" distR="0">
-            <wp:extent cx="2924175" cy="1952625"/>
+            <wp:extent cx="2647950" cy="1724025"/>
             <wp:effectExtent t="0" r="0" b="0" l="0"/>
-            <wp:docPr id="2" name="fig2_3phase.png" descr="Three-wire connection of the recorder and phasor diagram" title="Three-wire connection of the recorder and phasor diagram"/>
+            <wp:docPr id="2" name="fig2_3phase_wave.png" descr="Three-phase voltage waveforms 120 degrees apart" title="Three-phase voltage waveforms 120 degrees apart"/>
             <wp:cNvGraphicFramePr>
               <a:graphicFrameLocks xmlns:a="http://schemas.openxmlformats.org/drawingml/2006/main" noChangeAspect="1"/>
             </wp:cNvGraphicFramePr>
@@ -1549,7 +1624,7 @@
                   <pic:spPr bwMode="auto">
                     <a:xfrm>
                       <a:off x="0" y="0"/>
-                      <a:ext cx="2924175" cy="1952625"/>
+                      <a:ext cx="2647950" cy="1724025"/>
                     </a:xfrm>
                     <a:prstGeom prst="rect">
                       <a:avLst/>
@@ -1573,7 +1648,7 @@
           <w:sz w:val="18"/>
           <w:szCs w:val="18"/>
         </w:rPr>
-        <w:t xml:space="preserve">Fig. 2 (a) Connection of the recorder to the three-wire AC bus. (b) Phasor diagram with the line-to-line voltages, the phase currents and the displacement angle φ (exaggerated).</w:t>
+        <w:t xml:space="preserve">Fig. 2 Phase voltages of the three-phase AC bus (60 Hz, 383 V rms line-to-line): equal amplitude, displaced by 120°.</w:t>
       </w:r>
     </w:p>
     <w:p>
@@ -1588,7 +1663,7 @@
           <w:sz w:val="20"/>
           <w:szCs w:val="20"/>
         </w:rPr>
-        <w:t xml:space="preserve">The phasors computed from the records confirm the setting of Fig. 2b. The three line-to-line voltages are 120° apart within ±1.5° (sequence a-b-c), the currents lag the phase voltages by 0.5° to 4.3°, and the voltage and current unbalance average 0.9% (maxima 3.8% and 3.6%). The mean line-to-line voltage is 383 V, within the inverter limits of 334 to 418 V. The power computed from the fundamental phasors agrees with Eq. (1) with a median difference of −0.13%, and the daytime power factor is 0.995.</w:t>
+        <w:t xml:space="preserve">The main record (19:46 on 16 October to 18:05 on 19 October 2026) was sampled at 2 ms, thinned to 10 ms and averaged to one-minute values (4,201 values, no gap longer than 90 s); seven two-hour records from 2025 and 2026 were thinned to 20 ms. Thinning without a filter aliases the 60 Hz waveforms, but at 10 ms and 20 ms the samples fall on five equally spaced points of the cycle, so the power ripple averages out over a minute; an interval of whole cycles, such as 200 ms, samples a single point and was avoided. As the raw files were not kept, this was tested on 400 synthetic minutes with the measured unbalance and displacement, current harmonics up to 3% and power changes up to ±30%: the one-minute power from 10 ms and 20 ms samples differs from a 0.1 ms reference by at most 0.06% and 0.05% (0.12% at a grid frequency of exactly 60 Hz), against up to 12% for 200 ms. The thinning therefore does not bias the active power.</w:t>
       </w:r>
     </w:p>
     <w:p>
@@ -1603,7 +1678,23 @@
           <w:sz w:val="20"/>
           <w:szCs w:val="20"/>
         </w:rPr>
-        <w:t xml:space="preserve">The main record runs from 19:46 on 16 October 2026 to 18:05 on 19 October 2026. It was sampled at 2 ms, thinned to every fifth sample (10 ms) and averaged to one-minute values (4,201 values, no gap longer than 90 s). Seven records of about two hours were taken in 2025 and 2026 at 0.2 ms and thinned to 20 ms. Thinning without filtering aliases the 60 Hz waveforms, but the mean power is still correct when the sampling instants are spread evenly over the cycle: at 10 ms and 20 ms the samples fall on five equally spaced phase positions, and the power ripple at twice the grid frequency and at the harmonic frequencies averages out over a minute. A thinning interval that is a whole number of cycles, such as 200 ms, places all samples at the same phase and was therefore avoided. Because the raw 2 ms files are not kept, this was tested with 400 synthetic minutes built from the measured properties above (unbalance up to 3.8%, displacement up to 5°, current harmonics of 3% (5th) to 1% (13th), power change of up to ±30% within the minute). With the grid frequency between 59.95 and 60.05 Hz, the one-minute power from 10 ms and 20 ms samples differs from a 0.1 ms reference by at most 0.06% and 0.05%, and by at most 0.12% and 0.12% with the frequency locked at exactly 60 Hz. Samples 200 ms apart err by up to 4.6% and 12% in the same two cases. The thinning therefore does not bias the active power.</w:t>
+        <w:t xml:space="preserve">The measurement chain was not calibrated; the night-time offset is −0.011 kW. On 18 October the "today" energy shown by the three inverter displays summed to 572 kWh at 16:58, 3.0% more than the 555 kWh integrated by the recorder up to that time; the middle inverter showed 39.3% of the recorded energy, against a module share of 37.6%.</w:t>
+      </w:r>
+    </w:p>
+    <w:p>
+      <w:pPr>
+        <w:keepNext/>
+        <w:spacing w:after="40" w:before="100"/>
+      </w:pPr>
+      <w:r>
+        <w:rPr>
+          <w:rFonts w:ascii="Times New Roman" w:cs="Times New Roman" w:eastAsia="Times New Roman" w:hAnsi="Times New Roman"/>
+          <w:b/>
+          <w:bCs/>
+          <w:sz w:val="20"/>
+          <w:szCs w:val="20"/>
+        </w:rPr>
+        <w:t xml:space="preserve">2.4 Model chain</w:t>
       </w:r>
     </w:p>
     <w:p>
@@ -1618,38 +1709,7 @@
           <w:sz w:val="20"/>
           <w:szCs w:val="20"/>
         </w:rPr>
-        <w:t xml:space="preserve">The measurement chain was not calibrated. Two checks are available. The night-time offset is −0.011 kW. On 18 October the "today" energy shown by the three inverter displays summed to 572 kWh at 16:58, 3.0% more than the 555 kWh integrated by the recorder up to that time; the middle inverter showed 39.3% of the recorded energy, against a module share of 37.6%.</w:t>
-      </w:r>
-    </w:p>
-    <w:p>
-      <w:pPr>
-        <w:keepNext/>
-        <w:spacing w:after="40" w:before="100"/>
-      </w:pPr>
-      <w:r>
-        <w:rPr>
-          <w:rFonts w:ascii="Times New Roman" w:cs="Times New Roman" w:eastAsia="Times New Roman" w:hAnsi="Times New Roman"/>
-          <w:b/>
-          <w:bCs/>
-          <w:sz w:val="20"/>
-          <w:szCs w:val="20"/>
-        </w:rPr>
-        <w:t xml:space="preserve">2.4 Model chain</w:t>
-      </w:r>
-    </w:p>
-    <w:p>
-      <w:pPr>
-        <w:spacing w:after="0" w:before="0" w:line="240"/>
-        <w:ind w:firstLine="400"/>
-        <w:jc w:val="both"/>
-      </w:pPr>
-      <w:r>
-        <w:rPr>
-          <w:rFonts w:ascii="Times New Roman" w:cs="Times New Roman" w:eastAsia="Times New Roman" w:hAnsi="Times New Roman"/>
-          <w:sz w:val="20"/>
-          <w:szCs w:val="20"/>
-        </w:rPr>
-        <w:t xml:space="preserve">GHI is split with the Erbs model [19], transposed to the tilted plane with the Perez model [20] (albedo 0.25), and cell temperature follows Ross [21] with NOCT 46 °C (Fig. 3). DC power is calculated with PVWatts [3],</w:t>
+        <w:t xml:space="preserve">GHI is split with the Erbs model [19], transposed to the tilted plane with the Perez model [20] (albedo 0.25), and cell temperature follows Ross [21] with NOCT 46 °C. DC power is calculated with PVWatts [3],</w:t>
       </w:r>
     </w:p>
     <w:p>
@@ -1800,7 +1860,7 @@
           <w:sz w:val="20"/>
           <w:szCs w:val="20"/>
         </w:rPr>
-        <w:t xml:space="preserve">	(2)</w:t>
+        <w:t xml:space="preserve">	(3)</w:t>
       </w:r>
     </w:p>
     <w:p>
@@ -1875,15 +1935,109 @@
     <w:p>
       <w:pPr>
         <w:keepNext/>
+        <w:spacing w:after="80" w:before="160"/>
+        <w:jc w:val="center"/>
+      </w:pPr>
+      <w:r>
+        <w:rPr>
+          <w:rFonts w:ascii="Times New Roman" w:cs="Times New Roman" w:eastAsia="Times New Roman" w:hAnsi="Times New Roman"/>
+          <w:b/>
+          <w:bCs/>
+          <w:sz w:val="22"/>
+          <w:szCs w:val="22"/>
+        </w:rPr>
+        <w:t xml:space="preserve">3. Annual Uncertainty Budget</w:t>
+      </w:r>
+    </w:p>
+    <w:p>
+      <w:pPr>
+        <w:keepNext/>
+        <w:spacing w:after="40" w:before="100"/>
+      </w:pPr>
+      <w:r>
+        <w:rPr>
+          <w:rFonts w:ascii="Times New Roman" w:cs="Times New Roman" w:eastAsia="Times New Roman" w:hAnsi="Times New Roman"/>
+          <w:b/>
+          <w:bCs/>
+          <w:sz w:val="20"/>
+          <w:szCs w:val="20"/>
+        </w:rPr>
+        <w:t xml:space="preserve">3.1 Factors and ranges</w:t>
+      </w:r>
+    </w:p>
+    <w:p>
+      <w:pPr>
+        <w:spacing w:after="0" w:before="0" w:line="240"/>
+        <w:ind w:firstLine="400"/>
+        <w:jc w:val="both"/>
+      </w:pPr>
+      <w:r>
+        <w:rPr>
+          <w:rFonts w:ascii="Times New Roman" w:cs="Times New Roman" w:eastAsia="Times New Roman" w:hAnsi="Times New Roman"/>
+          <w:sz w:val="20"/>
+          <w:szCs w:val="20"/>
+        </w:rPr>
+        <w:t xml:space="preserve">Nine factors were varied (Table 2). Continuous factors are uniformly distributed over the stated range and model choices are drawn with equal weight among the options available in pvlib. The DC-loss range runs from no loss to the PVWatts default total loss including shading [3]; the GHI error of ±5% reflects the uncertainty of station pyranometers and of irradiation at a distant site [8], and ±10% is reported as a wider case. These ranges are assumptions, and the ranking of the factors depends on them: a wider GHI range moves weight from DC loss to irradiation (Table 2). Saltelli sampling [12] with SALib [26] was used for the first-order and total indices.</w:t>
+      </w:r>
+    </w:p>
+    <w:p>
+      <w:pPr>
+        <w:keepNext/>
+        <w:spacing w:after="40" w:before="100"/>
+      </w:pPr>
+      <w:r>
+        <w:rPr>
+          <w:rFonts w:ascii="Times New Roman" w:cs="Times New Roman" w:eastAsia="Times New Roman" w:hAnsi="Times New Roman"/>
+          <w:b/>
+          <w:bCs/>
+          <w:sz w:val="20"/>
+          <w:szCs w:val="20"/>
+        </w:rPr>
+        <w:t xml:space="preserve">3.2 Results and convergence</w:t>
+      </w:r>
+    </w:p>
+    <w:p>
+      <w:pPr>
+        <w:spacing w:after="0" w:before="0" w:line="240"/>
+        <w:ind w:firstLine="400"/>
+        <w:jc w:val="both"/>
+      </w:pPr>
+      <w:r>
+        <w:rPr>
+          <w:rFonts w:ascii="Times New Roman" w:cs="Times New Roman" w:eastAsia="Times New Roman" w:hAnsi="Times New Roman"/>
+          <w:sz w:val="20"/>
+          <w:szCs w:val="20"/>
+        </w:rPr>
+        <w:t xml:space="preserve">The baseline gives 195 MWh AC (1399 kWh/kWp). The 5th to 95th percentile of the annual energy spans −5.5% to +11.4% of the baseline. DC loss and irradiation error together explain 84% of the variance (Fig. 3, Table 2); the inverter model ranks third (7%, and 3% with ±10% GHI error). Interactions are negligible (the sums of the first-order and total indices differ by 0.005), and the mapping changes the energy by less than 0.01%. At the baseline loss no inverter reaches its limit in the hourly data; without DC loss, clipping amounts to at most 21 kWh per year.</w:t>
+      </w:r>
+    </w:p>
+    <w:p>
+      <w:pPr>
+        <w:spacing w:after="0" w:before="0" w:line="240"/>
+        <w:ind w:firstLine="400"/>
+        <w:jc w:val="both"/>
+      </w:pPr>
+      <w:r>
+        <w:rPr>
+          <w:rFonts w:ascii="Times New Roman" w:cs="Times New Roman" w:eastAsia="Times New Roman" w:hAnsi="Times New Roman"/>
+          <w:sz w:val="20"/>
+          <w:szCs w:val="20"/>
+        </w:rPr>
+        <w:t xml:space="preserve">To test convergence, the number of base samples was raised from 64 to 4,096 (45,056 model runs), and five further scrambling seeds were run at 1,024. Between 1,024 and 4,096 samples the total indices change by at most 0.003 (±5% case) and 0.003 (±10%), the standard deviation over the seeds is at most 0.002, and the ranking of the first five factors does not change from 64 samples onward. Table 2 gives the total indices at 4,096 samples with 95% bootstrap confidence intervals. The intervals of the first five factors do not overlap, so their order is resolved; the last four factors have indices below 0.005 and are not ranked.</w:t>
+      </w:r>
+    </w:p>
+    <w:p>
+      <w:pPr>
+        <w:keepNext/>
         <w:spacing w:after="0" w:before="60"/>
         <w:jc w:val="center"/>
       </w:pPr>
       <w:r>
         <w:drawing>
           <wp:inline distT="0" distB="0" distL="0" distR="0">
-            <wp:extent cx="2647950" cy="2609850"/>
+            <wp:extent cx="2609850" cy="2057400"/>
             <wp:effectExtent t="0" r="0" b="0" l="0"/>
-            <wp:docPr id="3" name="fig_flow.png" descr="Model chain and pvlib functions" title="Model chain and pvlib functions"/>
+            <wp:docPr id="3" name="fig_sens.png" descr="One-at-a-time change and Sobol total index" title="One-at-a-time change and Sobol total index"/>
             <wp:cNvGraphicFramePr>
               <a:graphicFrameLocks xmlns:a="http://schemas.openxmlformats.org/drawingml/2006/main" noChangeAspect="1"/>
             </wp:cNvGraphicFramePr>
@@ -1906,7 +2060,7 @@
                   <pic:spPr bwMode="auto">
                     <a:xfrm>
                       <a:off x="0" y="0"/>
-                      <a:ext cx="2647950" cy="2609850"/>
+                      <a:ext cx="2609850" cy="2057400"/>
                     </a:xfrm>
                     <a:prstGeom prst="rect">
                       <a:avLst/>
@@ -1930,162 +2084,7 @@
           <w:sz w:val="18"/>
           <w:szCs w:val="18"/>
         </w:rPr>
-        <w:t xml:space="preserve">Fig. 3 The model chain and the pvlib functions used. Orange: inverter stage implemented and checked here.</w:t>
-      </w:r>
-    </w:p>
-    <w:p>
-      <w:pPr>
-        <w:keepNext/>
-        <w:spacing w:after="80" w:before="160"/>
-        <w:jc w:val="center"/>
-      </w:pPr>
-      <w:r>
-        <w:rPr>
-          <w:rFonts w:ascii="Times New Roman" w:cs="Times New Roman" w:eastAsia="Times New Roman" w:hAnsi="Times New Roman"/>
-          <w:b/>
-          <w:bCs/>
-          <w:sz w:val="22"/>
-          <w:szCs w:val="22"/>
-        </w:rPr>
-        <w:t xml:space="preserve">3. Annual Uncertainty Budget</w:t>
-      </w:r>
-    </w:p>
-    <w:p>
-      <w:pPr>
-        <w:keepNext/>
-        <w:spacing w:after="40" w:before="100"/>
-      </w:pPr>
-      <w:r>
-        <w:rPr>
-          <w:rFonts w:ascii="Times New Roman" w:cs="Times New Roman" w:eastAsia="Times New Roman" w:hAnsi="Times New Roman"/>
-          <w:b/>
-          <w:bCs/>
-          <w:sz w:val="20"/>
-          <w:szCs w:val="20"/>
-        </w:rPr>
-        <w:t xml:space="preserve">3.1 Factors and ranges</w:t>
-      </w:r>
-    </w:p>
-    <w:p>
-      <w:pPr>
-        <w:spacing w:after="0" w:before="0" w:line="240"/>
-        <w:ind w:firstLine="400"/>
-        <w:jc w:val="both"/>
-      </w:pPr>
-      <w:r>
-        <w:rPr>
-          <w:rFonts w:ascii="Times New Roman" w:cs="Times New Roman" w:eastAsia="Times New Roman" w:hAnsi="Times New Roman"/>
-          <w:sz w:val="20"/>
-          <w:szCs w:val="20"/>
-        </w:rPr>
-        <w:t xml:space="preserve">Nine factors were varied (Table 2). Continuous factors are uniformly distributed over the stated range and model choices are drawn with equal weight among the options available in pvlib. The DC-loss range runs from no loss to the PVWatts default total loss including shading [3]; the GHI error of ±5% reflects the uncertainty of station pyranometers and of irradiation at a distant site [8], and ±10% is reported as a wider case. These ranges are assumptions, and the ranking of the factors depends on them: a wider GHI range moves weight from DC loss to irradiation (Table 2). Saltelli sampling [12] with SALib [26] was used for the first-order and total indices.</w:t>
-      </w:r>
-    </w:p>
-    <w:p>
-      <w:pPr>
-        <w:keepNext/>
-        <w:spacing w:after="40" w:before="100"/>
-      </w:pPr>
-      <w:r>
-        <w:rPr>
-          <w:rFonts w:ascii="Times New Roman" w:cs="Times New Roman" w:eastAsia="Times New Roman" w:hAnsi="Times New Roman"/>
-          <w:b/>
-          <w:bCs/>
-          <w:sz w:val="20"/>
-          <w:szCs w:val="20"/>
-        </w:rPr>
-        <w:t xml:space="preserve">3.2 Results and convergence</w:t>
-      </w:r>
-    </w:p>
-    <w:p>
-      <w:pPr>
-        <w:spacing w:after="0" w:before="0" w:line="240"/>
-        <w:ind w:firstLine="400"/>
-        <w:jc w:val="both"/>
-      </w:pPr>
-      <w:r>
-        <w:rPr>
-          <w:rFonts w:ascii="Times New Roman" w:cs="Times New Roman" w:eastAsia="Times New Roman" w:hAnsi="Times New Roman"/>
-          <w:sz w:val="20"/>
-          <w:szCs w:val="20"/>
-        </w:rPr>
-        <w:t xml:space="preserve">The baseline gives 195 MWh AC (1399 kWh/kWp). The 5th to 95th percentile of the annual energy spans −5.5% to +11.4% of the baseline. DC loss and irradiation error together explain 84% of the variance (Fig. 4, Table 2); the inverter model ranks third (7%, and 3% with ±10% GHI error). Interactions are negligible (the sums of the first-order and total indices differ by 0.005), and the mapping changes the energy by less than 0.01%. At the baseline loss no inverter reaches its limit in the hourly data; without DC loss, clipping amounts to at most 21 kWh per year.</w:t>
-      </w:r>
-    </w:p>
-    <w:p>
-      <w:pPr>
-        <w:spacing w:after="0" w:before="0" w:line="240"/>
-        <w:ind w:firstLine="400"/>
-        <w:jc w:val="both"/>
-      </w:pPr>
-      <w:r>
-        <w:rPr>
-          <w:rFonts w:ascii="Times New Roman" w:cs="Times New Roman" w:eastAsia="Times New Roman" w:hAnsi="Times New Roman"/>
-          <w:sz w:val="20"/>
-          <w:szCs w:val="20"/>
-        </w:rPr>
-        <w:t xml:space="preserve">To test convergence, the number of base samples was raised from 64 to 4,096 (45,056 model runs), and five further scrambling seeds were run at 1,024. Between 1,024 and 4,096 samples the total indices change by at most 0.003 (±5% case) and 0.003 (±10%), the standard deviation over the seeds is at most 0.002, and the ranking of the first five factors does not change from 64 samples onward. Table 2 gives the total indices at 4,096 samples with 95% bootstrap confidence intervals. The intervals of the first five factors do not overlap, so their order is resolved; the last four factors have indices below 0.005 and are not ranked.</w:t>
-      </w:r>
-    </w:p>
-    <w:p>
-      <w:pPr>
-        <w:keepNext/>
-        <w:spacing w:after="0" w:before="60"/>
-        <w:jc w:val="center"/>
-      </w:pPr>
-      <w:r>
-        <w:drawing>
-          <wp:inline distT="0" distB="0" distL="0" distR="0">
-            <wp:extent cx="2876550" cy="2266950"/>
-            <wp:effectExtent t="0" r="0" b="0" l="0"/>
-            <wp:docPr id="4" name="fig_sens.png" descr="One-at-a-time change and Sobol total index" title="One-at-a-time change and Sobol total index"/>
-            <wp:cNvGraphicFramePr>
-              <a:graphicFrameLocks xmlns:a="http://schemas.openxmlformats.org/drawingml/2006/main" noChangeAspect="1"/>
-            </wp:cNvGraphicFramePr>
-            <a:graphic xmlns:a="http://schemas.openxmlformats.org/drawingml/2006/main">
-              <a:graphicData uri="http://schemas.openxmlformats.org/drawingml/2006/picture">
-                <pic:pic xmlns:pic="http://schemas.openxmlformats.org/drawingml/2006/picture">
-                  <pic:nvPicPr>
-                    <pic:cNvPr id="0" name="" descr=""/>
-                    <pic:cNvPicPr>
-                      <a:picLocks noChangeAspect="1" noChangeArrowheads="1"/>
-                    </pic:cNvPicPr>
-                  </pic:nvPicPr>
-                  <pic:blipFill>
-                    <a:blip r:embed="rId16" cstate="none"/>
-                    <a:srcRect/>
-                    <a:stretch>
-                      <a:fillRect/>
-                    </a:stretch>
-                  </pic:blipFill>
-                  <pic:spPr bwMode="auto">
-                    <a:xfrm>
-                      <a:off x="0" y="0"/>
-                      <a:ext cx="2876550" cy="2266950"/>
-                    </a:xfrm>
-                    <a:prstGeom prst="rect">
-                      <a:avLst/>
-                    </a:prstGeom>
-                  </pic:spPr>
-                </pic:pic>
-              </a:graphicData>
-            </a:graphic>
-          </wp:inline>
-        </w:drawing>
-      </w:r>
-    </w:p>
-    <w:p>
-      <w:pPr>
-        <w:spacing w:after="120" w:before="40"/>
-        <w:jc w:val="both"/>
-      </w:pPr>
-      <w:r>
-        <w:rPr>
-          <w:rFonts w:ascii="Times New Roman" w:cs="Times New Roman" w:eastAsia="Times New Roman" w:hAnsi="Times New Roman"/>
-          <w:sz w:val="18"/>
-          <w:szCs w:val="18"/>
-        </w:rPr>
-        <w:t xml:space="preserve">Fig. 4 Change in annual AC energy when one factor is moved within its range: orange = setting that lowers the energy most, blue = setting that raises it most; text: Sobol total index (1,024 samples).</w:t>
+        <w:t xml:space="preserve">Fig. 3 Change in annual AC energy when one factor is moved within its range: orange = setting that lowers the energy most, blue = setting that raises it most; text: Sobol total index (1,024 samples).</w:t>
       </w:r>
     </w:p>
     <w:p>
@@ -4633,7 +4632,55 @@
           <w:sz w:val="20"/>
           <w:szCs w:val="20"/>
         </w:rPr>
-        <w:t xml:space="preserve">Station and ERA5 irradiation differ by a mean bias of +2.6% and an RMSE of 37% (r = 0.83) over the daytime hours of 2023. The annual modeled energy changes by +3.4% when ERA5 replaces the station, but the monthly energy changes by −12% to +19%, because biases of opposite sign cancel over the year (Fig. 5). For monthly estimates the weather source is therefore a larger uncertainty than the inverter formulation.</w:t>
+        <w:t xml:space="preserve">Station and ERA5 irradiation differ by a mean bias of +2.6% and an RMSE of 37% (r = 0.83) over the daytime hours of 2023. The annual modeled energy changes by +3.4% when ERA5 replaces the station, but the monthly energy changes by −12% to +19%, because biases of opposite sign cancel over the year (ERA5 is higher from December to June and lower from July to November). For monthly estimates the weather source is therefore a larger uncertainty than the inverter formulation.</w:t>
+      </w:r>
+    </w:p>
+    <w:p>
+      <w:pPr>
+        <w:keepNext/>
+        <w:spacing w:after="80" w:before="160"/>
+        <w:jc w:val="center"/>
+      </w:pPr>
+      <w:r>
+        <w:rPr>
+          <w:rFonts w:ascii="Times New Roman" w:cs="Times New Roman" w:eastAsia="Times New Roman" w:hAnsi="Times New Roman"/>
+          <w:b/>
+          <w:bCs/>
+          <w:sz w:val="22"/>
+          <w:szCs w:val="22"/>
+        </w:rPr>
+        <w:t xml:space="preserve">4. Field Validation</w:t>
+      </w:r>
+    </w:p>
+    <w:p>
+      <w:pPr>
+        <w:keepNext/>
+        <w:spacing w:after="40" w:before="100"/>
+      </w:pPr>
+      <w:r>
+        <w:rPr>
+          <w:rFonts w:ascii="Times New Roman" w:cs="Times New Roman" w:eastAsia="Times New Roman" w:hAnsi="Times New Roman"/>
+          <w:b/>
+          <w:bCs/>
+          <w:sz w:val="20"/>
+          <w:szCs w:val="20"/>
+        </w:rPr>
+        <w:t xml:space="preserve">4.1 Measured output</w:t>
+      </w:r>
+    </w:p>
+    <w:p>
+      <w:pPr>
+        <w:spacing w:after="0" w:before="0" w:line="240"/>
+        <w:ind w:firstLine="400"/>
+        <w:jc w:val="both"/>
+      </w:pPr>
+      <w:r>
+        <w:rPr>
+          <w:rFonts w:ascii="Times New Roman" w:cs="Times New Roman" w:eastAsia="Times New Roman" w:hAnsi="Times New Roman"/>
+          <w:sz w:val="20"/>
+          <w:szCs w:val="20"/>
+        </w:rPr>
+        <w:t xml:space="preserve">Fig. 4 shows the three recorded days. On 17 and 18 October the plant produced 585 and 557 kWh (4.20 and 3.99 kWh/kWp). The maximum one-minute power is 100.5 kW (77% of the 130 kW rating), so there is no sign of clipping. According to the station, both days were almost free of cloud (97 and 94% of clear-sky irradiation), yet the power curve is not smooth: between 10:00 and 14:00 the standard deviation of the one-minute power changes is 0.06 and 0.13 of the mean power, compared with 0.003 on a clear day in February. The AC data alone cannot show whether these dips are caused by small clouds, aerosol or inverter behavior.</w:t>
       </w:r>
     </w:p>
     <w:p>
@@ -4645,9 +4692,222 @@
       <w:r>
         <w:drawing>
           <wp:inline distT="0" distB="0" distL="0" distR="0">
-            <wp:extent cx="2876550" cy="1609725"/>
+            <wp:extent cx="2381250" cy="1952625"/>
             <wp:effectExtent t="0" r="0" b="0" l="0"/>
-            <wp:docPr id="5" name="fig_hourly.png" descr="Monthly AC energy, station vs ERA5" title="Monthly AC energy, station vs ERA5"/>
+            <wp:docPr id="4" name="fig_meas3d.png" descr="Measured AC power 16-19 Oct 2026" title="Measured AC power 16-19 Oct 2026"/>
+            <wp:cNvGraphicFramePr>
+              <a:graphicFrameLocks xmlns:a="http://schemas.openxmlformats.org/drawingml/2006/main" noChangeAspect="1"/>
+            </wp:cNvGraphicFramePr>
+            <a:graphic xmlns:a="http://schemas.openxmlformats.org/drawingml/2006/main">
+              <a:graphicData uri="http://schemas.openxmlformats.org/drawingml/2006/picture">
+                <pic:pic xmlns:pic="http://schemas.openxmlformats.org/drawingml/2006/picture">
+                  <pic:nvPicPr>
+                    <pic:cNvPr id="0" name="" descr=""/>
+                    <pic:cNvPicPr>
+                      <a:picLocks noChangeAspect="1" noChangeArrowheads="1"/>
+                    </pic:cNvPicPr>
+                  </pic:nvPicPr>
+                  <pic:blipFill>
+                    <a:blip r:embed="rId16" cstate="none"/>
+                    <a:srcRect/>
+                    <a:stretch>
+                      <a:fillRect/>
+                    </a:stretch>
+                  </pic:blipFill>
+                  <pic:spPr bwMode="auto">
+                    <a:xfrm>
+                      <a:off x="0" y="0"/>
+                      <a:ext cx="2381250" cy="1952625"/>
+                    </a:xfrm>
+                    <a:prstGeom prst="rect">
+                      <a:avLst/>
+                    </a:prstGeom>
+                  </pic:spPr>
+                </pic:pic>
+              </a:graphicData>
+            </a:graphic>
+          </wp:inline>
+        </w:drawing>
+      </w:r>
+    </w:p>
+    <w:p>
+      <w:pPr>
+        <w:spacing w:after="120" w:before="40"/>
+        <w:jc w:val="both"/>
+      </w:pPr>
+      <w:r>
+        <w:rPr>
+          <w:rFonts w:ascii="Times New Roman" w:cs="Times New Roman" w:eastAsia="Times New Roman" w:hAnsi="Times New Roman"/>
+          <w:sz w:val="18"/>
+          <w:szCs w:val="18"/>
+        </w:rPr>
+        <w:t xml:space="preserve">Fig. 4 Measured AC power, 16 to 19 October 2026 (one-minute means).</w:t>
+      </w:r>
+    </w:p>
+    <w:p>
+      <w:pPr>
+        <w:keepNext/>
+        <w:spacing w:after="40" w:before="100"/>
+      </w:pPr>
+      <w:r>
+        <w:rPr>
+          <w:rFonts w:ascii="Times New Roman" w:cs="Times New Roman" w:eastAsia="Times New Roman" w:hAnsi="Times New Roman"/>
+          <w:b/>
+          <w:bCs/>
+          <w:sz w:val="20"/>
+          <w:szCs w:val="20"/>
+        </w:rPr>
+        <w:t xml:space="preserve">4.2 Model against measurement</w:t>
+      </w:r>
+    </w:p>
+    <w:p>
+      <w:pPr>
+        <w:spacing w:after="0" w:before="0" w:line="240"/>
+        <w:ind w:firstLine="400"/>
+        <w:jc w:val="both"/>
+      </w:pPr>
+      <w:r>
+        <w:rPr>
+          <w:rFonts w:ascii="Times New Roman" w:cs="Times New Roman" w:eastAsia="Times New Roman" w:hAnsi="Times New Roman"/>
+          <w:sz w:val="20"/>
+          <w:szCs w:val="20"/>
+        </w:rPr>
+        <w:t xml:space="preserve">We express the agreement as the ratio of measured to modeled energy,</w:t>
+      </w:r>
+    </w:p>
+    <w:p>
+      <w:pPr>
+        <w:tabs>
+          <w:tab w:val="center" w:pos="2183"/>
+          <w:tab w:val="right" w:pos="4365"/>
+        </w:tabs>
+        <w:spacing w:after="60" w:before="60"/>
+      </w:pPr>
+      <w:r>
+        <w:rPr>
+          <w:rFonts w:ascii="Times New Roman" w:cs="Times New Roman" w:eastAsia="Times New Roman" w:hAnsi="Times New Roman"/>
+          <w:sz w:val="20"/>
+          <w:szCs w:val="20"/>
+        </w:rPr>
+        <w:t xml:space="preserve">	</w:t>
+      </w:r>
+      <w:r>
+        <w:rPr>
+          <w:rFonts w:ascii="Times New Roman" w:cs="Times New Roman" w:eastAsia="Times New Roman" w:hAnsi="Times New Roman"/>
+          <w:i/>
+          <w:iCs/>
+          <w:sz w:val="20"/>
+          <w:szCs w:val="20"/>
+        </w:rPr>
+        <w:t xml:space="preserve">R</w:t>
+      </w:r>
+      <w:r>
+        <w:rPr>
+          <w:rFonts w:ascii="Times New Roman" w:cs="Times New Roman" w:eastAsia="Times New Roman" w:hAnsi="Times New Roman"/>
+          <w:sz w:val="20"/>
+          <w:szCs w:val="20"/>
+        </w:rPr>
+        <w:t xml:space="preserve"> = Σ</w:t>
+      </w:r>
+      <w:r>
+        <w:rPr>
+          <w:rFonts w:ascii="Times New Roman" w:cs="Times New Roman" w:eastAsia="Times New Roman" w:hAnsi="Times New Roman"/>
+          <w:i/>
+          <w:iCs/>
+          <w:sz w:val="20"/>
+          <w:szCs w:val="20"/>
+        </w:rPr>
+        <w:t xml:space="preserve">P</w:t>
+      </w:r>
+      <w:r>
+        <w:rPr>
+          <w:rFonts w:ascii="Times New Roman" w:cs="Times New Roman" w:eastAsia="Times New Roman" w:hAnsi="Times New Roman"/>
+          <w:sz w:val="20"/>
+          <w:szCs w:val="20"/>
+          <w:vertAlign w:val="subscript"/>
+        </w:rPr>
+        <w:t xml:space="preserve">actual</w:t>
+      </w:r>
+      <w:r>
+        <w:rPr>
+          <w:rFonts w:ascii="Times New Roman" w:cs="Times New Roman" w:eastAsia="Times New Roman" w:hAnsi="Times New Roman"/>
+          <w:sz w:val="20"/>
+          <w:szCs w:val="20"/>
+        </w:rPr>
+        <w:t xml:space="preserve"> / Σ</w:t>
+      </w:r>
+      <w:r>
+        <w:rPr>
+          <w:rFonts w:ascii="Times New Roman" w:cs="Times New Roman" w:eastAsia="Times New Roman" w:hAnsi="Times New Roman"/>
+          <w:i/>
+          <w:iCs/>
+          <w:sz w:val="20"/>
+          <w:szCs w:val="20"/>
+        </w:rPr>
+        <w:t xml:space="preserve">P</w:t>
+      </w:r>
+      <w:r>
+        <w:rPr>
+          <w:rFonts w:ascii="Times New Roman" w:cs="Times New Roman" w:eastAsia="Times New Roman" w:hAnsi="Times New Roman"/>
+          <w:sz w:val="20"/>
+          <w:szCs w:val="20"/>
+          <w:vertAlign w:val="subscript"/>
+        </w:rPr>
+        <w:t xml:space="preserve">model</w:t>
+      </w:r>
+      <w:r>
+        <w:rPr>
+          <w:rFonts w:ascii="Times New Roman" w:cs="Times New Roman" w:eastAsia="Times New Roman" w:hAnsi="Times New Roman"/>
+          <w:sz w:val="20"/>
+          <w:szCs w:val="20"/>
+        </w:rPr>
+        <w:t xml:space="preserve">	(4)</w:t>
+      </w:r>
+    </w:p>
+    <w:p>
+      <w:pPr>
+        <w:spacing w:after="0" w:before="0" w:line="240"/>
+        <w:jc w:val="both"/>
+      </w:pPr>
+      <w:r>
+        <w:rPr>
+          <w:rFonts w:ascii="Times New Roman" w:cs="Times New Roman" w:eastAsia="Times New Roman" w:hAnsi="Times New Roman"/>
+          <w:sz w:val="20"/>
+          <w:szCs w:val="20"/>
+        </w:rPr>
+        <w:t xml:space="preserve">summed over the hours of a record (</w:t>
+      </w:r>
+      <w:r>
+        <w:rPr>
+          <w:rFonts w:ascii="Times New Roman" w:cs="Times New Roman" w:eastAsia="Times New Roman" w:hAnsi="Times New Roman"/>
+          <w:i/>
+          <w:iCs/>
+          <w:sz w:val="20"/>
+          <w:szCs w:val="20"/>
+        </w:rPr>
+        <w:t xml:space="preserve">R</w:t>
+      </w:r>
+      <w:r>
+        <w:rPr>
+          <w:rFonts w:ascii="Times New Roman" w:cs="Times New Roman" w:eastAsia="Times New Roman" w:hAnsi="Times New Roman"/>
+          <w:sz w:val="20"/>
+          <w:szCs w:val="20"/>
+        </w:rPr>
+        <w:t xml:space="preserve"> &lt; 1: model too high). Fig. 5 and Table 4 compare the hourly means with the baseline. A high correlation shows only that the shape of the curve is reproduced (r = 0.99 and 0.97; centroid shift of 0.05 and 0.10 h); the error of the level is given by the mean bias error (MBE) and the root mean square error (RMSE), normalized by the mean measured power. The model is higher in almost every hour, by 12.3 kW on average (nMBE +23% and +24%, nRMSE 27% and 31%). The measured energy is 0.81 of the modeled energy on both days, and the measured performance ratio is 0.63 against 0.78 for the model. A third clear day, 19 October (to 18:00), gives the same ratio (0.80). The ratio shows no consistent morning/afternoon asymmetry (0.82 and 0.80 on 17 October, 0.76 and 0.86 on 18 October), so a fixed one-sided obstruction is unlikely to be the main cause. With this bias the model does not predict the hourly power on clear days.</w:t>
+      </w:r>
+    </w:p>
+    <w:p>
+      <w:pPr>
+        <w:keepNext/>
+        <w:spacing w:after="0" w:before="60"/>
+        <w:jc w:val="center"/>
+      </w:pPr>
+      <w:r>
+        <w:drawing>
+          <wp:inline distT="0" distB="0" distL="0" distR="0">
+            <wp:extent cx="2609850" cy="2495550"/>
+            <wp:effectExtent t="0" r="0" b="0" l="0"/>
+            <wp:docPr id="5" name="fig_modelvs_rev.png" descr="Hourly measured and modeled power, 17-18 Oct" title="Hourly measured and modeled power, 17-18 Oct"/>
             <wp:cNvGraphicFramePr>
               <a:graphicFrameLocks xmlns:a="http://schemas.openxmlformats.org/drawingml/2006/main" noChangeAspect="1"/>
             </wp:cNvGraphicFramePr>
@@ -4670,7 +4930,7 @@
                   <pic:spPr bwMode="auto">
                     <a:xfrm>
                       <a:off x="0" y="0"/>
-                      <a:ext cx="2876550" cy="1609725"/>
+                      <a:ext cx="2609850" cy="2495550"/>
                     </a:xfrm>
                     <a:prstGeom prst="rect">
                       <a:avLst/>
@@ -4694,208 +4954,7 @@
           <w:sz w:val="18"/>
           <w:szCs w:val="18"/>
         </w:rPr>
-        <w:t xml:space="preserve">Fig. 5 Monthly AC energy of the same model chain driven by station GHI or ERA5 GHI (2023).</w:t>
-      </w:r>
-    </w:p>
-    <w:p>
-      <w:pPr>
-        <w:keepNext/>
-        <w:spacing w:after="80" w:before="160"/>
-        <w:jc w:val="center"/>
-      </w:pPr>
-      <w:r>
-        <w:rPr>
-          <w:rFonts w:ascii="Times New Roman" w:cs="Times New Roman" w:eastAsia="Times New Roman" w:hAnsi="Times New Roman"/>
-          <w:b/>
-          <w:bCs/>
-          <w:sz w:val="22"/>
-          <w:szCs w:val="22"/>
-        </w:rPr>
-        <w:t xml:space="preserve">4. Field Validation</w:t>
-      </w:r>
-    </w:p>
-    <w:p>
-      <w:pPr>
-        <w:keepNext/>
-        <w:spacing w:after="40" w:before="100"/>
-      </w:pPr>
-      <w:r>
-        <w:rPr>
-          <w:rFonts w:ascii="Times New Roman" w:cs="Times New Roman" w:eastAsia="Times New Roman" w:hAnsi="Times New Roman"/>
-          <w:b/>
-          <w:bCs/>
-          <w:sz w:val="20"/>
-          <w:szCs w:val="20"/>
-        </w:rPr>
-        <w:t xml:space="preserve">4.1 Measured output</w:t>
-      </w:r>
-    </w:p>
-    <w:p>
-      <w:pPr>
-        <w:spacing w:after="0" w:before="0" w:line="240"/>
-        <w:ind w:firstLine="400"/>
-        <w:jc w:val="both"/>
-      </w:pPr>
-      <w:r>
-        <w:rPr>
-          <w:rFonts w:ascii="Times New Roman" w:cs="Times New Roman" w:eastAsia="Times New Roman" w:hAnsi="Times New Roman"/>
-          <w:sz w:val="20"/>
-          <w:szCs w:val="20"/>
-        </w:rPr>
-        <w:t xml:space="preserve">Fig. 6 shows the three recorded days. On 17 and 18 October the plant produced 585 and 557 kWh (4.20 and 3.99 kWh/kWp). The maximum one-minute power is 100.5 kW (77% of the 130 kW rating), so there is no sign of clipping. According to the station, both days were almost free of cloud (97 and 94% of clear-sky irradiation), yet the power curve is not smooth: between 10:00 and 14:00 the standard deviation of the one-minute power changes is 0.06 and 0.13 of the mean power, compared with 0.003 on a clear day in February. The AC data alone cannot show whether these dips are caused by small clouds, aerosol or inverter behavior.</w:t>
-      </w:r>
-    </w:p>
-    <w:p>
-      <w:pPr>
-        <w:keepNext/>
-        <w:spacing w:after="0" w:before="60"/>
-        <w:jc w:val="center"/>
-      </w:pPr>
-      <w:r>
-        <w:drawing>
-          <wp:inline distT="0" distB="0" distL="0" distR="0">
-            <wp:extent cx="2743200" cy="2247900"/>
-            <wp:effectExtent t="0" r="0" b="0" l="0"/>
-            <wp:docPr id="6" name="fig_meas3d.png" descr="Measured AC power 16-19 Oct 2026" title="Measured AC power 16-19 Oct 2026"/>
-            <wp:cNvGraphicFramePr>
-              <a:graphicFrameLocks xmlns:a="http://schemas.openxmlformats.org/drawingml/2006/main" noChangeAspect="1"/>
-            </wp:cNvGraphicFramePr>
-            <a:graphic xmlns:a="http://schemas.openxmlformats.org/drawingml/2006/main">
-              <a:graphicData uri="http://schemas.openxmlformats.org/drawingml/2006/picture">
-                <pic:pic xmlns:pic="http://schemas.openxmlformats.org/drawingml/2006/picture">
-                  <pic:nvPicPr>
-                    <pic:cNvPr id="0" name="" descr=""/>
-                    <pic:cNvPicPr>
-                      <a:picLocks noChangeAspect="1" noChangeArrowheads="1"/>
-                    </pic:cNvPicPr>
-                  </pic:nvPicPr>
-                  <pic:blipFill>
-                    <a:blip r:embed="rId18" cstate="none"/>
-                    <a:srcRect/>
-                    <a:stretch>
-                      <a:fillRect/>
-                    </a:stretch>
-                  </pic:blipFill>
-                  <pic:spPr bwMode="auto">
-                    <a:xfrm>
-                      <a:off x="0" y="0"/>
-                      <a:ext cx="2743200" cy="2247900"/>
-                    </a:xfrm>
-                    <a:prstGeom prst="rect">
-                      <a:avLst/>
-                    </a:prstGeom>
-                  </pic:spPr>
-                </pic:pic>
-              </a:graphicData>
-            </a:graphic>
-          </wp:inline>
-        </w:drawing>
-      </w:r>
-    </w:p>
-    <w:p>
-      <w:pPr>
-        <w:spacing w:after="120" w:before="40"/>
-        <w:jc w:val="both"/>
-      </w:pPr>
-      <w:r>
-        <w:rPr>
-          <w:rFonts w:ascii="Times New Roman" w:cs="Times New Roman" w:eastAsia="Times New Roman" w:hAnsi="Times New Roman"/>
-          <w:sz w:val="18"/>
-          <w:szCs w:val="18"/>
-        </w:rPr>
-        <w:t xml:space="preserve">Fig. 6 Measured AC power, 16 to 19 October 2026 (one-minute means).</w:t>
-      </w:r>
-    </w:p>
-    <w:p>
-      <w:pPr>
-        <w:keepNext/>
-        <w:spacing w:after="40" w:before="100"/>
-      </w:pPr>
-      <w:r>
-        <w:rPr>
-          <w:rFonts w:ascii="Times New Roman" w:cs="Times New Roman" w:eastAsia="Times New Roman" w:hAnsi="Times New Roman"/>
-          <w:b/>
-          <w:bCs/>
-          <w:sz w:val="20"/>
-          <w:szCs w:val="20"/>
-        </w:rPr>
-        <w:t xml:space="preserve">4.2 Model against measurement</w:t>
-      </w:r>
-    </w:p>
-    <w:p>
-      <w:pPr>
-        <w:spacing w:after="0" w:before="0" w:line="240"/>
-        <w:ind w:firstLine="400"/>
-        <w:jc w:val="both"/>
-      </w:pPr>
-      <w:r>
-        <w:rPr>
-          <w:rFonts w:ascii="Times New Roman" w:cs="Times New Roman" w:eastAsia="Times New Roman" w:hAnsi="Times New Roman"/>
-          <w:sz w:val="20"/>
-          <w:szCs w:val="20"/>
-        </w:rPr>
-        <w:t xml:space="preserve">Fig. 7 and Table 4 compare the hourly means with the baseline. A high correlation shows only that the shape of the curve is reproduced (r = 0.99 and 0.97; centroid shift of 0.05 and 0.10 h); the error of the level is given by the mean bias error (MBE) and the root mean square error (RMSE), normalized by the mean measured power. The model is higher in almost every hour, by 12.3 kW on average (nMBE +23% and +24%, nRMSE 27% and 31%). The measured energy is 0.81 of the modeled energy on both days, and the measured performance ratio is 0.63 against 0.78 for the model. A third clear day, 19 October (to 18:00), gives the same ratio (0.80). The ratio shows no consistent morning/afternoon asymmetry (0.82 and 0.80 on 17 October, 0.76 and 0.86 on 18 October; Fig. 8), so a fixed one-sided obstruction is unlikely to be the main cause. With this bias the model does not predict the hourly power on clear days.</w:t>
-      </w:r>
-    </w:p>
-    <w:p>
-      <w:pPr>
-        <w:keepNext/>
-        <w:spacing w:after="0" w:before="60"/>
-        <w:jc w:val="center"/>
-      </w:pPr>
-      <w:r>
-        <w:drawing>
-          <wp:inline distT="0" distB="0" distL="0" distR="0">
-            <wp:extent cx="2876550" cy="2743200"/>
-            <wp:effectExtent t="0" r="0" b="0" l="0"/>
-            <wp:docPr id="7" name="fig_modelvs_rev.png" descr="Hourly measured and modeled power, 17-18 Oct" title="Hourly measured and modeled power, 17-18 Oct"/>
-            <wp:cNvGraphicFramePr>
-              <a:graphicFrameLocks xmlns:a="http://schemas.openxmlformats.org/drawingml/2006/main" noChangeAspect="1"/>
-            </wp:cNvGraphicFramePr>
-            <a:graphic xmlns:a="http://schemas.openxmlformats.org/drawingml/2006/main">
-              <a:graphicData uri="http://schemas.openxmlformats.org/drawingml/2006/picture">
-                <pic:pic xmlns:pic="http://schemas.openxmlformats.org/drawingml/2006/picture">
-                  <pic:nvPicPr>
-                    <pic:cNvPr id="0" name="" descr=""/>
-                    <pic:cNvPicPr>
-                      <a:picLocks noChangeAspect="1" noChangeArrowheads="1"/>
-                    </pic:cNvPicPr>
-                  </pic:nvPicPr>
-                  <pic:blipFill>
-                    <a:blip r:embed="rId19" cstate="none"/>
-                    <a:srcRect/>
-                    <a:stretch>
-                      <a:fillRect/>
-                    </a:stretch>
-                  </pic:blipFill>
-                  <pic:spPr bwMode="auto">
-                    <a:xfrm>
-                      <a:off x="0" y="0"/>
-                      <a:ext cx="2876550" cy="2743200"/>
-                    </a:xfrm>
-                    <a:prstGeom prst="rect">
-                      <a:avLst/>
-                    </a:prstGeom>
-                  </pic:spPr>
-                </pic:pic>
-              </a:graphicData>
-            </a:graphic>
-          </wp:inline>
-        </w:drawing>
-      </w:r>
-    </w:p>
-    <w:p>
-      <w:pPr>
-        <w:spacing w:after="120" w:before="40"/>
-        <w:jc w:val="both"/>
-      </w:pPr>
-      <w:r>
-        <w:rPr>
-          <w:rFonts w:ascii="Times New Roman" w:cs="Times New Roman" w:eastAsia="Times New Roman" w:hAnsi="Times New Roman"/>
-          <w:sz w:val="18"/>
-          <w:szCs w:val="18"/>
-        </w:rPr>
-        <w:t xml:space="preserve">Fig. 7 Hourly mean AC power, measured and modeled. The band runs from the baseline to the stacked lower bounds of Section 4.4 (all factors at their lowest end).</w:t>
+        <w:t xml:space="preserve">Fig. 5 Hourly mean AC power, measured and modeled. The band runs from the baseline to the stacked lower bounds of Section 4.4 (all factors at their lowest end).</w:t>
       </w:r>
     </w:p>
     <w:p>
@@ -6670,15 +6729,92 @@
     <w:p>
       <w:pPr>
         <w:keepNext/>
+        <w:spacing w:after="40" w:before="100"/>
+      </w:pPr>
+      <w:r>
+        <w:rPr>
+          <w:rFonts w:ascii="Times New Roman" w:cs="Times New Roman" w:eastAsia="Times New Roman" w:hAnsi="Times New Roman"/>
+          <w:b/>
+          <w:bCs/>
+          <w:sz w:val="20"/>
+          <w:szCs w:val="20"/>
+        </w:rPr>
+        <w:t xml:space="preserve">4.3 Other records</w:t>
+      </w:r>
+    </w:p>
+    <w:p>
+      <w:pPr>
+        <w:spacing w:after="0" w:before="0" w:line="240"/>
+        <w:ind w:firstLine="400"/>
+        <w:jc w:val="both"/>
+      </w:pPr>
+      <w:r>
+        <w:rPr>
+          <w:rFonts w:ascii="Times New Roman" w:cs="Times New Roman" w:eastAsia="Times New Roman" w:hAnsi="Times New Roman"/>
+          <w:sz w:val="20"/>
+          <w:szCs w:val="20"/>
+        </w:rPr>
+        <w:t xml:space="preserve">Across the nine days with station data the ratio of measured to modeled energy lies between 0.65 and 1.01. On the five days with a clear-sky fraction above 0.9 it ranges from 0.80 to 1.01 (Table 4). Cloudy and rainy days carry little weight because a station 21 km away does not follow the cloud above the roof. With so few records a seasonal pattern cannot be separated from day-to-day differences. A single correction factor does not transfer between days either: the factor fitted on 17 October (0.812) leaves a bias of +0.9% on 18 October and −0.5% on 21 December, but −8.6% on 10 February and −19.7% on 7 August. The ratio must therefore not be used as an annual correction.</w:t>
+      </w:r>
+    </w:p>
+    <w:p>
+      <w:pPr>
+        <w:keepNext/>
+        <w:spacing w:after="40" w:before="100"/>
+      </w:pPr>
+      <w:r>
+        <w:rPr>
+          <w:rFonts w:ascii="Times New Roman" w:cs="Times New Roman" w:eastAsia="Times New Roman" w:hAnsi="Times New Roman"/>
+          <w:b/>
+          <w:bCs/>
+          <w:sz w:val="20"/>
+          <w:szCs w:val="20"/>
+        </w:rPr>
+        <w:t xml:space="preserve">4.4 Closing the budget</w:t>
+      </w:r>
+    </w:p>
+    <w:p>
+      <w:pPr>
+        <w:spacing w:after="0" w:before="0" w:line="240"/>
+        <w:ind w:firstLine="400"/>
+        <w:jc w:val="both"/>
+      </w:pPr>
+      <w:r>
+        <w:rPr>
+          <w:rFonts w:ascii="Times New Roman" w:cs="Times New Roman" w:eastAsia="Times New Roman" w:hAnsi="Times New Roman"/>
+          <w:sz w:val="20"/>
+          <w:szCs w:val="20"/>
+        </w:rPr>
+        <w:t xml:space="preserve">Fig. 6 stacks the lower end of every factor on the baseline of 17 and 18 October. The earlier version of this stack left out two model options that lower the energy: isotropic transposition (−3.9% alone) and the Boland decomposition (−1.0%). They are now included. With the PVWatts-G inverter, a DC loss of 11.4%, NOCT 48 °C, the incidence-angle loss, isotropic transposition and Boland decomposition, the model falls to 87.0%, and an irradiation 5% lower brings it to 82.0%, close to the measured 81% (ratio 0.99 and 0.98).</w:t>
+      </w:r>
+    </w:p>
+    <w:p>
+      <w:pPr>
+        <w:spacing w:after="0" w:before="0" w:line="240"/>
+        <w:ind w:firstLine="400"/>
+        <w:jc w:val="both"/>
+      </w:pPr>
+      <w:r>
+        <w:rPr>
+          <w:rFonts w:ascii="Times New Roman" w:cs="Times New Roman" w:eastAsia="Times New Roman" w:hAnsi="Times New Roman"/>
+          <w:sz w:val="20"/>
+          <w:szCs w:val="20"/>
+        </w:rPr>
+        <w:t xml:space="preserve">The budget can thus reach the measurement, but only at its joint extreme, which is not a plausible state for three reasons. First, the isotropic model ignores circumsolar and horizon brightening and underestimates the irradiance on tilted planes under clear skies [27]; on days that were 94 to 97% of clear-sky irradiation it is the least suitable option. Second, all lower ends together lower the annual energy by 13.6%, far beyond the 5th percentile of the budget (−5.5%), which the sampled distribution almost never reaches. Third, the same setting on 10 February gives a ratio of 1.06, i.e. it underestimates that clear day by 6%. No single set of factor values fits the clear days in October and February.</w:t>
+      </w:r>
+    </w:p>
+    <w:p>
+      <w:pPr>
+        <w:keepNext/>
         <w:spacing w:after="0" w:before="60"/>
         <w:jc w:val="center"/>
       </w:pPr>
       <w:r>
         <w:drawing>
           <wp:inline distT="0" distB="0" distL="0" distR="0">
-            <wp:extent cx="2743200" cy="1743075"/>
+            <wp:extent cx="2562225" cy="1876425"/>
             <wp:effectExtent t="0" r="0" b="0" l="0"/>
-            <wp:docPr id="8" name="fig_ratio_hour.png" descr="Measured over modeled by hour" title="Measured over modeled by hour"/>
+            <wp:docPr id="6" name="fig_closure_rev.png" descr="Stacked lower bounds" title="Stacked lower bounds"/>
             <wp:cNvGraphicFramePr>
               <a:graphicFrameLocks xmlns:a="http://schemas.openxmlformats.org/drawingml/2006/main" noChangeAspect="1"/>
             </wp:cNvGraphicFramePr>
@@ -6692,7 +6828,7 @@
                     </pic:cNvPicPr>
                   </pic:nvPicPr>
                   <pic:blipFill>
-                    <a:blip r:embed="rId20" cstate="none"/>
+                    <a:blip r:embed="rId18" cstate="none"/>
                     <a:srcRect/>
                     <a:stretch>
                       <a:fillRect/>
@@ -6701,7 +6837,7 @@
                   <pic:spPr bwMode="auto">
                     <a:xfrm>
                       <a:off x="0" y="0"/>
-                      <a:ext cx="2743200" cy="1743075"/>
+                      <a:ext cx="2562225" cy="1876425"/>
                     </a:xfrm>
                     <a:prstGeom prst="rect">
                       <a:avLst/>
@@ -6725,7 +6861,7 @@
           <w:sz w:val="18"/>
           <w:szCs w:val="18"/>
         </w:rPr>
-        <w:t xml:space="preserve">Fig. 8 Measured over modeled hourly power by hour for the clear-sky records.</w:t>
+        <w:t xml:space="preserve">Fig. 6 Modeled energy as a percentage of the baseline with the lower ends stacked; orange: options added in this revision; red line: measured.</w:t>
       </w:r>
     </w:p>
     <w:p>
@@ -6741,7 +6877,7 @@
           <w:sz w:val="20"/>
           <w:szCs w:val="20"/>
         </w:rPr>
-        <w:t xml:space="preserve">4.3 Other records</w:t>
+        <w:t xml:space="preserve">4.5 Long-term check with the inverter energy counters</w:t>
       </w:r>
     </w:p>
     <w:p>
@@ -6756,84 +6892,7 @@
           <w:sz w:val="20"/>
           <w:szCs w:val="20"/>
         </w:rPr>
-        <w:t xml:space="preserve">Across the nine days with station data the ratio of measured to modeled energy lies between 0.65 and 1.01 (Fig. 9). On the five days with a clear-sky fraction above 0.9 it ranges from 0.80 to 1.01 (Table 4). Cloudy and rainy days carry little weight because a station 21 km away does not follow the cloud above the roof. With so few records a seasonal pattern cannot be separated from day-to-day differences. A single correction factor does not transfer between days either: the factor fitted on 17 October (0.812) leaves a bias of +0.9% on 18 October and −0.5% on 21 December, but −8.6% on 10 February and −19.7% on 7 August. The ratio must therefore not be used as an annual correction.</w:t>
-      </w:r>
-    </w:p>
-    <w:p>
-      <w:pPr>
-        <w:keepNext/>
-        <w:spacing w:after="0" w:before="60"/>
-        <w:jc w:val="center"/>
-      </w:pPr>
-      <w:r>
-        <w:drawing>
-          <wp:inline distT="0" distB="0" distL="0" distR="0">
-            <wp:extent cx="2743200" cy="2495550"/>
-            <wp:effectExtent t="0" r="0" b="0" l="0"/>
-            <wp:docPr id="9" name="fig_campaigns.png" descr="Clear-sky fraction and ratio per record" title="Clear-sky fraction and ratio per record"/>
-            <wp:cNvGraphicFramePr>
-              <a:graphicFrameLocks xmlns:a="http://schemas.openxmlformats.org/drawingml/2006/main" noChangeAspect="1"/>
-            </wp:cNvGraphicFramePr>
-            <a:graphic xmlns:a="http://schemas.openxmlformats.org/drawingml/2006/main">
-              <a:graphicData uri="http://schemas.openxmlformats.org/drawingml/2006/picture">
-                <pic:pic xmlns:pic="http://schemas.openxmlformats.org/drawingml/2006/picture">
-                  <pic:nvPicPr>
-                    <pic:cNvPr id="0" name="" descr=""/>
-                    <pic:cNvPicPr>
-                      <a:picLocks noChangeAspect="1" noChangeArrowheads="1"/>
-                    </pic:cNvPicPr>
-                  </pic:nvPicPr>
-                  <pic:blipFill>
-                    <a:blip r:embed="rId21" cstate="none"/>
-                    <a:srcRect/>
-                    <a:stretch>
-                      <a:fillRect/>
-                    </a:stretch>
-                  </pic:blipFill>
-                  <pic:spPr bwMode="auto">
-                    <a:xfrm>
-                      <a:off x="0" y="0"/>
-                      <a:ext cx="2743200" cy="2495550"/>
-                    </a:xfrm>
-                    <a:prstGeom prst="rect">
-                      <a:avLst/>
-                    </a:prstGeom>
-                  </pic:spPr>
-                </pic:pic>
-              </a:graphicData>
-            </a:graphic>
-          </wp:inline>
-        </w:drawing>
-      </w:r>
-    </w:p>
-    <w:p>
-      <w:pPr>
-        <w:spacing w:after="120" w:before="40"/>
-        <w:jc w:val="both"/>
-      </w:pPr>
-      <w:r>
-        <w:rPr>
-          <w:rFonts w:ascii="Times New Roman" w:cs="Times New Roman" w:eastAsia="Times New Roman" w:hAnsi="Times New Roman"/>
-          <w:sz w:val="18"/>
-          <w:szCs w:val="18"/>
-        </w:rPr>
-        <w:t xml:space="preserve">Fig. 9 (a) Clear-sky fraction of the station irradiation and (b) measured over modeled energy per record. Blue: fraction above 0.9.</w:t>
-      </w:r>
-    </w:p>
-    <w:p>
-      <w:pPr>
-        <w:keepNext/>
-        <w:spacing w:after="40" w:before="100"/>
-      </w:pPr>
-      <w:r>
-        <w:rPr>
-          <w:rFonts w:ascii="Times New Roman" w:cs="Times New Roman" w:eastAsia="Times New Roman" w:hAnsi="Times New Roman"/>
-          <w:b/>
-          <w:bCs/>
-          <w:sz w:val="20"/>
-          <w:szCs w:val="20"/>
-        </w:rPr>
-        <w:t xml:space="preserve">4.4 Closing the budget</w:t>
+        <w:t xml:space="preserve">The short records cover only a few days. A longer check is given by the lifetime energy counters of the inverters, read on 18 October 2026, 1280 days after commissioning on 17 April 2023: 269,093 kWh for the left and 264,693 kWh for the middle 50 kW inverter. The model with the as-built layout and 2023 weather, repeated for each calendar day of the same period, gives 267.0 and 257.7 MWh. The counters are thus 0.8% and 2.7% above the model (1411 and 1437 against 1399 kWh/kWp per year). The counter of the 30 kW inverter shows 3.6 GWh after 497,827 h, which is impossible, and was not used.</w:t>
       </w:r>
     </w:p>
     <w:p>
@@ -6848,1263 +6907,7 @@
           <w:sz w:val="20"/>
           <w:szCs w:val="20"/>
         </w:rPr>
-        <w:t xml:space="preserve">Table 5 lists single changes, and Fig. 10 stacks the lower end of every factor on the baseline of 17 and 18 October. The earlier version of this stack left out two model options that lower the energy: isotropic transposition (−3.9% alone) and the Boland decomposition (−1.0%). They are now included. With the PVWatts-G inverter, a DC loss of 11.4%, NOCT 48 °C, the incidence-angle loss, isotropic transposition and Boland decomposition, the model falls to 87.0%, and an irradiation 5% lower brings it to 82.0%, close to the measured 81% (ratio 0.99 and 0.98).</w:t>
-      </w:r>
-    </w:p>
-    <w:p>
-      <w:pPr>
-        <w:spacing w:after="0" w:before="0" w:line="240"/>
-        <w:ind w:firstLine="400"/>
-        <w:jc w:val="both"/>
-      </w:pPr>
-      <w:r>
-        <w:rPr>
-          <w:rFonts w:ascii="Times New Roman" w:cs="Times New Roman" w:eastAsia="Times New Roman" w:hAnsi="Times New Roman"/>
-          <w:sz w:val="20"/>
-          <w:szCs w:val="20"/>
-        </w:rPr>
-        <w:t xml:space="preserve">The budget can thus reach the measurement, but only at its joint extreme, which is not a plausible state for three reasons. First, the isotropic model ignores circumsolar and horizon brightening and underestimates the irradiance on tilted planes under clear skies [27]; on days that were 94 to 97% of clear-sky irradiation it is the least suitable option. Second, all lower ends together lower the annual energy by 13.6%, far beyond the 5th percentile of the budget (−5.5%), which the sampled distribution almost never reaches. Third, the same setting on 10 February gives a ratio of 1.06, i.e. it underestimates that clear day by 6%. No single set of factor values fits the clear days in October and February.</w:t>
-      </w:r>
-    </w:p>
-    <w:p>
-      <w:pPr>
-        <w:keepNext/>
-        <w:spacing w:after="40" w:before="80"/>
-        <w:jc w:val="center"/>
-      </w:pPr>
-      <w:r>
-        <w:rPr>
-          <w:rFonts w:ascii="Times New Roman" w:cs="Times New Roman" w:eastAsia="Times New Roman" w:hAnsi="Times New Roman"/>
-          <w:sz w:val="18"/>
-          <w:szCs w:val="18"/>
-        </w:rPr>
-        <w:t xml:space="preserve">Table 5 Effect of single changes on the modeled energy of 17 and 18 October (mean of both days).</w:t>
-      </w:r>
-    </w:p>
-    <w:tbl>
-      <w:tblPr>
-        <w:tblW w:type="dxa" w:w="4365"/>
-        <w:jc w:val="center"/>
-        <w:tblBorders>
-          <w:top w:val="none" w:color="FFFFFF" w:sz="0"/>
-          <w:left w:val="none" w:color="FFFFFF" w:sz="0"/>
-          <w:bottom w:val="none" w:color="FFFFFF" w:sz="0"/>
-          <w:right w:val="none" w:color="FFFFFF" w:sz="0"/>
-          <w:insideH w:val="none" w:color="FFFFFF" w:sz="0"/>
-          <w:insideV w:val="none" w:color="FFFFFF" w:sz="0"/>
-        </w:tblBorders>
-      </w:tblPr>
-      <w:tblGrid>
-        <w:gridCol w:w="2000"/>
-        <w:gridCol w:w="1250"/>
-        <w:gridCol w:w="1115"/>
-      </w:tblGrid>
-      <w:tr>
-        <w:trPr>
-          <w:cantSplit/>
-        </w:trPr>
-        <w:tc>
-          <w:tcPr>
-            <w:tcW w:type="dxa" w:w="2000"/>
-            <w:tcBorders>
-              <w:top w:val="single" w:color="000000" w:sz="8"/>
-              <w:left w:val="none" w:color="FFFFFF" w:sz="0"/>
-              <w:bottom w:val="none" w:color="FFFFFF" w:sz="0"/>
-              <w:right w:val="none" w:color="FFFFFF" w:sz="0"/>
-            </w:tcBorders>
-            <w:tcMar>
-              <w:top w:type="dxa" w:w="15"/>
-              <w:left w:type="dxa" w:w="35"/>
-              <w:bottom w:type="dxa" w:w="15"/>
-              <w:right w:type="dxa" w:w="35"/>
-            </w:tcMar>
-            <w:vAlign w:val="center"/>
-          </w:tcPr>
-          <w:p>
-            <w:pPr>
-              <w:keepNext/>
-              <w:keepLines/>
-              <w:jc w:val="left"/>
-            </w:pPr>
-            <w:r>
-              <w:rPr>
-                <w:rFonts w:ascii="Times New Roman" w:cs="Times New Roman" w:eastAsia="Times New Roman" w:hAnsi="Times New Roman"/>
-                <w:b/>
-                <w:bCs/>
-                <w:sz w:val="16"/>
-                <w:szCs w:val="16"/>
-              </w:rPr>
-              <w:t xml:space="preserve">Change</w:t>
-            </w:r>
-          </w:p>
-        </w:tc>
-        <w:tc>
-          <w:tcPr>
-            <w:tcW w:type="dxa" w:w="1250"/>
-            <w:tcBorders>
-              <w:top w:val="single" w:color="000000" w:sz="8"/>
-              <w:left w:val="none" w:color="FFFFFF" w:sz="0"/>
-              <w:bottom w:val="none" w:color="FFFFFF" w:sz="0"/>
-              <w:right w:val="none" w:color="FFFFFF" w:sz="0"/>
-            </w:tcBorders>
-            <w:tcMar>
-              <w:top w:type="dxa" w:w="15"/>
-              <w:left w:type="dxa" w:w="35"/>
-              <w:bottom w:type="dxa" w:w="15"/>
-              <w:right w:type="dxa" w:w="35"/>
-            </w:tcMar>
-            <w:vAlign w:val="center"/>
-          </w:tcPr>
-          <w:p>
-            <w:pPr>
-              <w:keepNext/>
-              <w:keepLines/>
-              <w:jc w:val="center"/>
-            </w:pPr>
-            <w:r>
-              <w:rPr>
-                <w:rFonts w:ascii="Times New Roman" w:cs="Times New Roman" w:eastAsia="Times New Roman" w:hAnsi="Times New Roman"/>
-                <w:b/>
-                <w:bCs/>
-                <w:sz w:val="16"/>
-                <w:szCs w:val="16"/>
-              </w:rPr>
-              <w:t xml:space="preserve">Δ energy (%)</w:t>
-            </w:r>
-          </w:p>
-        </w:tc>
-        <w:tc>
-          <w:tcPr>
-            <w:tcW w:type="dxa" w:w="1115"/>
-            <w:tcBorders>
-              <w:top w:val="single" w:color="000000" w:sz="8"/>
-              <w:left w:val="none" w:color="FFFFFF" w:sz="0"/>
-              <w:bottom w:val="none" w:color="FFFFFF" w:sz="0"/>
-              <w:right w:val="none" w:color="FFFFFF" w:sz="0"/>
-            </w:tcBorders>
-            <w:tcMar>
-              <w:top w:type="dxa" w:w="15"/>
-              <w:left w:type="dxa" w:w="35"/>
-              <w:bottom w:type="dxa" w:w="15"/>
-              <w:right w:type="dxa" w:w="35"/>
-            </w:tcMar>
-            <w:vAlign w:val="center"/>
-          </w:tcPr>
-          <w:p>
-            <w:pPr>
-              <w:keepNext/>
-              <w:keepLines/>
-              <w:jc w:val="center"/>
-            </w:pPr>
-            <w:r>
-              <w:rPr>
-                <w:rFonts w:ascii="Times New Roman" w:cs="Times New Roman" w:eastAsia="Times New Roman" w:hAnsi="Times New Roman"/>
-                <w:b/>
-                <w:bCs/>
-                <w:sz w:val="16"/>
-                <w:szCs w:val="16"/>
-              </w:rPr>
-              <w:t xml:space="preserve">Meas./model</w:t>
-            </w:r>
-          </w:p>
-        </w:tc>
-      </w:tr>
-      <w:tr>
-        <w:trPr>
-          <w:cantSplit/>
-        </w:trPr>
-        <w:tc>
-          <w:tcPr>
-            <w:tcW w:type="dxa" w:w="2000"/>
-            <w:tcBorders>
-              <w:top w:val="single" w:color="000000" w:sz="4"/>
-              <w:left w:val="none" w:color="FFFFFF" w:sz="0"/>
-              <w:bottom w:val="none" w:color="FFFFFF" w:sz="0"/>
-              <w:right w:val="none" w:color="FFFFFF" w:sz="0"/>
-            </w:tcBorders>
-            <w:tcMar>
-              <w:top w:type="dxa" w:w="15"/>
-              <w:left w:type="dxa" w:w="35"/>
-              <w:bottom w:type="dxa" w:w="15"/>
-              <w:right w:type="dxa" w:w="35"/>
-            </w:tcMar>
-            <w:vAlign w:val="center"/>
-          </w:tcPr>
-          <w:p>
-            <w:pPr>
-              <w:keepNext/>
-              <w:keepLines/>
-              <w:jc w:val="left"/>
-            </w:pPr>
-            <w:r>
-              <w:rPr>
-                <w:rFonts w:ascii="Times New Roman" w:cs="Times New Roman" w:eastAsia="Times New Roman" w:hAnsi="Times New Roman"/>
-                <w:b w:val="false"/>
-                <w:bCs w:val="false"/>
-                <w:sz w:val="16"/>
-                <w:szCs w:val="16"/>
-              </w:rPr>
-              <w:t xml:space="preserve">Baseline</w:t>
-            </w:r>
-          </w:p>
-        </w:tc>
-        <w:tc>
-          <w:tcPr>
-            <w:tcW w:type="dxa" w:w="1250"/>
-            <w:tcBorders>
-              <w:top w:val="single" w:color="000000" w:sz="4"/>
-              <w:left w:val="none" w:color="FFFFFF" w:sz="0"/>
-              <w:bottom w:val="none" w:color="FFFFFF" w:sz="0"/>
-              <w:right w:val="none" w:color="FFFFFF" w:sz="0"/>
-            </w:tcBorders>
-            <w:tcMar>
-              <w:top w:type="dxa" w:w="15"/>
-              <w:left w:type="dxa" w:w="35"/>
-              <w:bottom w:type="dxa" w:w="15"/>
-              <w:right w:type="dxa" w:w="35"/>
-            </w:tcMar>
-            <w:vAlign w:val="center"/>
-          </w:tcPr>
-          <w:p>
-            <w:pPr>
-              <w:keepNext/>
-              <w:keepLines/>
-              <w:jc w:val="center"/>
-            </w:pPr>
-            <w:r>
-              <w:rPr>
-                <w:rFonts w:ascii="Times New Roman" w:cs="Times New Roman" w:eastAsia="Times New Roman" w:hAnsi="Times New Roman"/>
-                <w:b w:val="false"/>
-                <w:bCs w:val="false"/>
-                <w:sz w:val="16"/>
-                <w:szCs w:val="16"/>
-              </w:rPr>
-              <w:t xml:space="preserve">0.0</w:t>
-            </w:r>
-          </w:p>
-        </w:tc>
-        <w:tc>
-          <w:tcPr>
-            <w:tcW w:type="dxa" w:w="1115"/>
-            <w:tcBorders>
-              <w:top w:val="single" w:color="000000" w:sz="4"/>
-              <w:left w:val="none" w:color="FFFFFF" w:sz="0"/>
-              <w:bottom w:val="none" w:color="FFFFFF" w:sz="0"/>
-              <w:right w:val="none" w:color="FFFFFF" w:sz="0"/>
-            </w:tcBorders>
-            <w:tcMar>
-              <w:top w:type="dxa" w:w="15"/>
-              <w:left w:type="dxa" w:w="35"/>
-              <w:bottom w:type="dxa" w:w="15"/>
-              <w:right w:type="dxa" w:w="35"/>
-            </w:tcMar>
-            <w:vAlign w:val="center"/>
-          </w:tcPr>
-          <w:p>
-            <w:pPr>
-              <w:keepNext/>
-              <w:keepLines/>
-              <w:jc w:val="center"/>
-            </w:pPr>
-            <w:r>
-              <w:rPr>
-                <w:rFonts w:ascii="Times New Roman" w:cs="Times New Roman" w:eastAsia="Times New Roman" w:hAnsi="Times New Roman"/>
-                <w:b w:val="false"/>
-                <w:bCs w:val="false"/>
-                <w:sz w:val="16"/>
-                <w:szCs w:val="16"/>
-              </w:rPr>
-              <w:t xml:space="preserve">0.81</w:t>
-            </w:r>
-          </w:p>
-        </w:tc>
-      </w:tr>
-      <w:tr>
-        <w:trPr>
-          <w:cantSplit/>
-        </w:trPr>
-        <w:tc>
-          <w:tcPr>
-            <w:tcW w:type="dxa" w:w="2000"/>
-            <w:tcBorders>
-              <w:top w:val="none" w:color="FFFFFF" w:sz="0"/>
-              <w:left w:val="none" w:color="FFFFFF" w:sz="0"/>
-              <w:bottom w:val="none" w:color="FFFFFF" w:sz="0"/>
-              <w:right w:val="none" w:color="FFFFFF" w:sz="0"/>
-            </w:tcBorders>
-            <w:tcMar>
-              <w:top w:type="dxa" w:w="15"/>
-              <w:left w:type="dxa" w:w="35"/>
-              <w:bottom w:type="dxa" w:w="15"/>
-              <w:right w:type="dxa" w:w="35"/>
-            </w:tcMar>
-            <w:vAlign w:val="center"/>
-          </w:tcPr>
-          <w:p>
-            <w:pPr>
-              <w:keepNext/>
-              <w:keepLines/>
-              <w:jc w:val="left"/>
-            </w:pPr>
-            <w:r>
-              <w:rPr>
-                <w:rFonts w:ascii="Times New Roman" w:cs="Times New Roman" w:eastAsia="Times New Roman" w:hAnsi="Times New Roman"/>
-                <w:b w:val="false"/>
-                <w:bCs w:val="false"/>
-                <w:sz w:val="16"/>
-                <w:szCs w:val="16"/>
-              </w:rPr>
-              <w:t xml:space="preserve">Constant efficiency</w:t>
-            </w:r>
-          </w:p>
-        </w:tc>
-        <w:tc>
-          <w:tcPr>
-            <w:tcW w:type="dxa" w:w="1250"/>
-            <w:tcBorders>
-              <w:top w:val="none" w:color="FFFFFF" w:sz="0"/>
-              <w:left w:val="none" w:color="FFFFFF" w:sz="0"/>
-              <w:bottom w:val="none" w:color="FFFFFF" w:sz="0"/>
-              <w:right w:val="none" w:color="FFFFFF" w:sz="0"/>
-            </w:tcBorders>
-            <w:tcMar>
-              <w:top w:type="dxa" w:w="15"/>
-              <w:left w:type="dxa" w:w="35"/>
-              <w:bottom w:type="dxa" w:w="15"/>
-              <w:right w:type="dxa" w:w="35"/>
-            </w:tcMar>
-            <w:vAlign w:val="center"/>
-          </w:tcPr>
-          <w:p>
-            <w:pPr>
-              <w:keepNext/>
-              <w:keepLines/>
-              <w:jc w:val="center"/>
-            </w:pPr>
-            <w:r>
-              <w:rPr>
-                <w:rFonts w:ascii="Times New Roman" w:cs="Times New Roman" w:eastAsia="Times New Roman" w:hAnsi="Times New Roman"/>
-                <w:b w:val="false"/>
-                <w:bCs w:val="false"/>
-                <w:sz w:val="16"/>
-                <w:szCs w:val="16"/>
-              </w:rPr>
-              <w:t xml:space="preserve">0.0</w:t>
-            </w:r>
-          </w:p>
-        </w:tc>
-        <w:tc>
-          <w:tcPr>
-            <w:tcW w:type="dxa" w:w="1115"/>
-            <w:tcBorders>
-              <w:top w:val="none" w:color="FFFFFF" w:sz="0"/>
-              <w:left w:val="none" w:color="FFFFFF" w:sz="0"/>
-              <w:bottom w:val="none" w:color="FFFFFF" w:sz="0"/>
-              <w:right w:val="none" w:color="FFFFFF" w:sz="0"/>
-            </w:tcBorders>
-            <w:tcMar>
-              <w:top w:type="dxa" w:w="15"/>
-              <w:left w:type="dxa" w:w="35"/>
-              <w:bottom w:type="dxa" w:w="15"/>
-              <w:right w:type="dxa" w:w="35"/>
-            </w:tcMar>
-            <w:vAlign w:val="center"/>
-          </w:tcPr>
-          <w:p>
-            <w:pPr>
-              <w:keepNext/>
-              <w:keepLines/>
-              <w:jc w:val="center"/>
-            </w:pPr>
-            <w:r>
-              <w:rPr>
-                <w:rFonts w:ascii="Times New Roman" w:cs="Times New Roman" w:eastAsia="Times New Roman" w:hAnsi="Times New Roman"/>
-                <w:b w:val="false"/>
-                <w:bCs w:val="false"/>
-                <w:sz w:val="16"/>
-                <w:szCs w:val="16"/>
-              </w:rPr>
-              <w:t xml:space="preserve">0.81</w:t>
-            </w:r>
-          </w:p>
-        </w:tc>
-      </w:tr>
-      <w:tr>
-        <w:trPr>
-          <w:cantSplit/>
-        </w:trPr>
-        <w:tc>
-          <w:tcPr>
-            <w:tcW w:type="dxa" w:w="2000"/>
-            <w:tcBorders>
-              <w:top w:val="none" w:color="FFFFFF" w:sz="0"/>
-              <w:left w:val="none" w:color="FFFFFF" w:sz="0"/>
-              <w:bottom w:val="none" w:color="FFFFFF" w:sz="0"/>
-              <w:right w:val="none" w:color="FFFFFF" w:sz="0"/>
-            </w:tcBorders>
-            <w:tcMar>
-              <w:top w:type="dxa" w:w="15"/>
-              <w:left w:type="dxa" w:w="35"/>
-              <w:bottom w:type="dxa" w:w="15"/>
-              <w:right w:type="dxa" w:w="35"/>
-            </w:tcMar>
-            <w:vAlign w:val="center"/>
-          </w:tcPr>
-          <w:p>
-            <w:pPr>
-              <w:keepNext/>
-              <w:keepLines/>
-              <w:jc w:val="left"/>
-            </w:pPr>
-            <w:r>
-              <w:rPr>
-                <w:rFonts w:ascii="Times New Roman" w:cs="Times New Roman" w:eastAsia="Times New Roman" w:hAnsi="Times New Roman"/>
-                <w:b w:val="false"/>
-                <w:bCs w:val="false"/>
-                <w:sz w:val="16"/>
-                <w:szCs w:val="16"/>
-              </w:rPr>
-              <w:t xml:space="preserve">PVWatts-G</w:t>
-            </w:r>
-          </w:p>
-        </w:tc>
-        <w:tc>
-          <w:tcPr>
-            <w:tcW w:type="dxa" w:w="1250"/>
-            <w:tcBorders>
-              <w:top w:val="none" w:color="FFFFFF" w:sz="0"/>
-              <w:left w:val="none" w:color="FFFFFF" w:sz="0"/>
-              <w:bottom w:val="none" w:color="FFFFFF" w:sz="0"/>
-              <w:right w:val="none" w:color="FFFFFF" w:sz="0"/>
-            </w:tcBorders>
-            <w:tcMar>
-              <w:top w:type="dxa" w:w="15"/>
-              <w:left w:type="dxa" w:w="35"/>
-              <w:bottom w:type="dxa" w:w="15"/>
-              <w:right w:type="dxa" w:w="35"/>
-            </w:tcMar>
-            <w:vAlign w:val="center"/>
-          </w:tcPr>
-          <w:p>
-            <w:pPr>
-              <w:keepNext/>
-              <w:keepLines/>
-              <w:jc w:val="center"/>
-            </w:pPr>
-            <w:r>
-              <w:rPr>
-                <w:rFonts w:ascii="Times New Roman" w:cs="Times New Roman" w:eastAsia="Times New Roman" w:hAnsi="Times New Roman"/>
-                <w:b w:val="false"/>
-                <w:bCs w:val="false"/>
-                <w:sz w:val="16"/>
-                <w:szCs w:val="16"/>
-              </w:rPr>
-              <w:t xml:space="preserve">−2.6</w:t>
-            </w:r>
-          </w:p>
-        </w:tc>
-        <w:tc>
-          <w:tcPr>
-            <w:tcW w:type="dxa" w:w="1115"/>
-            <w:tcBorders>
-              <w:top w:val="none" w:color="FFFFFF" w:sz="0"/>
-              <w:left w:val="none" w:color="FFFFFF" w:sz="0"/>
-              <w:bottom w:val="none" w:color="FFFFFF" w:sz="0"/>
-              <w:right w:val="none" w:color="FFFFFF" w:sz="0"/>
-            </w:tcBorders>
-            <w:tcMar>
-              <w:top w:type="dxa" w:w="15"/>
-              <w:left w:type="dxa" w:w="35"/>
-              <w:bottom w:type="dxa" w:w="15"/>
-              <w:right w:type="dxa" w:w="35"/>
-            </w:tcMar>
-            <w:vAlign w:val="center"/>
-          </w:tcPr>
-          <w:p>
-            <w:pPr>
-              <w:keepNext/>
-              <w:keepLines/>
-              <w:jc w:val="center"/>
-            </w:pPr>
-            <w:r>
-              <w:rPr>
-                <w:rFonts w:ascii="Times New Roman" w:cs="Times New Roman" w:eastAsia="Times New Roman" w:hAnsi="Times New Roman"/>
-                <w:b w:val="false"/>
-                <w:bCs w:val="false"/>
-                <w:sz w:val="16"/>
-                <w:szCs w:val="16"/>
-              </w:rPr>
-              <w:t xml:space="preserve">0.83</w:t>
-            </w:r>
-          </w:p>
-        </w:tc>
-      </w:tr>
-      <w:tr>
-        <w:trPr>
-          <w:cantSplit/>
-        </w:trPr>
-        <w:tc>
-          <w:tcPr>
-            <w:tcW w:type="dxa" w:w="2000"/>
-            <w:tcBorders>
-              <w:top w:val="none" w:color="FFFFFF" w:sz="0"/>
-              <w:left w:val="none" w:color="FFFFFF" w:sz="0"/>
-              <w:bottom w:val="none" w:color="FFFFFF" w:sz="0"/>
-              <w:right w:val="none" w:color="FFFFFF" w:sz="0"/>
-            </w:tcBorders>
-            <w:tcMar>
-              <w:top w:type="dxa" w:w="15"/>
-              <w:left w:type="dxa" w:w="35"/>
-              <w:bottom w:type="dxa" w:w="15"/>
-              <w:right w:type="dxa" w:w="35"/>
-            </w:tcMar>
-            <w:vAlign w:val="center"/>
-          </w:tcPr>
-          <w:p>
-            <w:pPr>
-              <w:keepNext/>
-              <w:keepLines/>
-              <w:jc w:val="left"/>
-            </w:pPr>
-            <w:r>
-              <w:rPr>
-                <w:rFonts w:ascii="Times New Roman" w:cs="Times New Roman" w:eastAsia="Times New Roman" w:hAnsi="Times New Roman"/>
-                <w:b w:val="false"/>
-                <w:bCs w:val="false"/>
-                <w:sz w:val="16"/>
-                <w:szCs w:val="16"/>
-              </w:rPr>
-              <w:t xml:space="preserve">DC loss 0% / 11.4%</w:t>
-            </w:r>
-          </w:p>
-        </w:tc>
-        <w:tc>
-          <w:tcPr>
-            <w:tcW w:type="dxa" w:w="1250"/>
-            <w:tcBorders>
-              <w:top w:val="none" w:color="FFFFFF" w:sz="0"/>
-              <w:left w:val="none" w:color="FFFFFF" w:sz="0"/>
-              <w:bottom w:val="none" w:color="FFFFFF" w:sz="0"/>
-              <w:right w:val="none" w:color="FFFFFF" w:sz="0"/>
-            </w:tcBorders>
-            <w:tcMar>
-              <w:top w:type="dxa" w:w="15"/>
-              <w:left w:type="dxa" w:w="35"/>
-              <w:bottom w:type="dxa" w:w="15"/>
-              <w:right w:type="dxa" w:w="35"/>
-            </w:tcMar>
-            <w:vAlign w:val="center"/>
-          </w:tcPr>
-          <w:p>
-            <w:pPr>
-              <w:keepNext/>
-              <w:keepLines/>
-              <w:jc w:val="center"/>
-            </w:pPr>
-            <w:r>
-              <w:rPr>
-                <w:rFonts w:ascii="Times New Roman" w:cs="Times New Roman" w:eastAsia="Times New Roman" w:hAnsi="Times New Roman"/>
-                <w:b w:val="false"/>
-                <w:bCs w:val="false"/>
-                <w:sz w:val="16"/>
-                <w:szCs w:val="16"/>
-              </w:rPr>
-              <w:t xml:space="preserve">+9.5 / −3.0</w:t>
-            </w:r>
-          </w:p>
-        </w:tc>
-        <w:tc>
-          <w:tcPr>
-            <w:tcW w:type="dxa" w:w="1115"/>
-            <w:tcBorders>
-              <w:top w:val="none" w:color="FFFFFF" w:sz="0"/>
-              <w:left w:val="none" w:color="FFFFFF" w:sz="0"/>
-              <w:bottom w:val="none" w:color="FFFFFF" w:sz="0"/>
-              <w:right w:val="none" w:color="FFFFFF" w:sz="0"/>
-            </w:tcBorders>
-            <w:tcMar>
-              <w:top w:type="dxa" w:w="15"/>
-              <w:left w:type="dxa" w:w="35"/>
-              <w:bottom w:type="dxa" w:w="15"/>
-              <w:right w:type="dxa" w:w="35"/>
-            </w:tcMar>
-            <w:vAlign w:val="center"/>
-          </w:tcPr>
-          <w:p>
-            <w:pPr>
-              <w:keepNext/>
-              <w:keepLines/>
-              <w:jc w:val="center"/>
-            </w:pPr>
-            <w:r>
-              <w:rPr>
-                <w:rFonts w:ascii="Times New Roman" w:cs="Times New Roman" w:eastAsia="Times New Roman" w:hAnsi="Times New Roman"/>
-                <w:b w:val="false"/>
-                <w:bCs w:val="false"/>
-                <w:sz w:val="16"/>
-                <w:szCs w:val="16"/>
-              </w:rPr>
-              <w:t xml:space="preserve">0.74 / 0.83</w:t>
-            </w:r>
-          </w:p>
-        </w:tc>
-      </w:tr>
-      <w:tr>
-        <w:trPr>
-          <w:cantSplit/>
-        </w:trPr>
-        <w:tc>
-          <w:tcPr>
-            <w:tcW w:type="dxa" w:w="2000"/>
-            <w:tcBorders>
-              <w:top w:val="none" w:color="FFFFFF" w:sz="0"/>
-              <w:left w:val="none" w:color="FFFFFF" w:sz="0"/>
-              <w:bottom w:val="none" w:color="FFFFFF" w:sz="0"/>
-              <w:right w:val="none" w:color="FFFFFF" w:sz="0"/>
-            </w:tcBorders>
-            <w:tcMar>
-              <w:top w:type="dxa" w:w="15"/>
-              <w:left w:type="dxa" w:w="35"/>
-              <w:bottom w:type="dxa" w:w="15"/>
-              <w:right w:type="dxa" w:w="35"/>
-            </w:tcMar>
-            <w:vAlign w:val="center"/>
-          </w:tcPr>
-          <w:p>
-            <w:pPr>
-              <w:keepNext/>
-              <w:keepLines/>
-              <w:jc w:val="left"/>
-            </w:pPr>
-            <w:r>
-              <w:rPr>
-                <w:rFonts w:ascii="Times New Roman" w:cs="Times New Roman" w:eastAsia="Times New Roman" w:hAnsi="Times New Roman"/>
-                <w:b w:val="false"/>
-                <w:bCs w:val="false"/>
-                <w:sz w:val="16"/>
-                <w:szCs w:val="16"/>
-              </w:rPr>
-              <w:t xml:space="preserve">GHI −5% / +5%</w:t>
-            </w:r>
-          </w:p>
-        </w:tc>
-        <w:tc>
-          <w:tcPr>
-            <w:tcW w:type="dxa" w:w="1250"/>
-            <w:tcBorders>
-              <w:top w:val="none" w:color="FFFFFF" w:sz="0"/>
-              <w:left w:val="none" w:color="FFFFFF" w:sz="0"/>
-              <w:bottom w:val="none" w:color="FFFFFF" w:sz="0"/>
-              <w:right w:val="none" w:color="FFFFFF" w:sz="0"/>
-            </w:tcBorders>
-            <w:tcMar>
-              <w:top w:type="dxa" w:w="15"/>
-              <w:left w:type="dxa" w:w="35"/>
-              <w:bottom w:type="dxa" w:w="15"/>
-              <w:right w:type="dxa" w:w="35"/>
-            </w:tcMar>
-            <w:vAlign w:val="center"/>
-          </w:tcPr>
-          <w:p>
-            <w:pPr>
-              <w:keepNext/>
-              <w:keepLines/>
-              <w:jc w:val="center"/>
-            </w:pPr>
-            <w:r>
-              <w:rPr>
-                <w:rFonts w:ascii="Times New Roman" w:cs="Times New Roman" w:eastAsia="Times New Roman" w:hAnsi="Times New Roman"/>
-                <w:b w:val="false"/>
-                <w:bCs w:val="false"/>
-                <w:sz w:val="16"/>
-                <w:szCs w:val="16"/>
-              </w:rPr>
-              <w:t xml:space="preserve">−4.3 / +4.3</w:t>
-            </w:r>
-          </w:p>
-        </w:tc>
-        <w:tc>
-          <w:tcPr>
-            <w:tcW w:type="dxa" w:w="1115"/>
-            <w:tcBorders>
-              <w:top w:val="none" w:color="FFFFFF" w:sz="0"/>
-              <w:left w:val="none" w:color="FFFFFF" w:sz="0"/>
-              <w:bottom w:val="none" w:color="FFFFFF" w:sz="0"/>
-              <w:right w:val="none" w:color="FFFFFF" w:sz="0"/>
-            </w:tcBorders>
-            <w:tcMar>
-              <w:top w:type="dxa" w:w="15"/>
-              <w:left w:type="dxa" w:w="35"/>
-              <w:bottom w:type="dxa" w:w="15"/>
-              <w:right w:type="dxa" w:w="35"/>
-            </w:tcMar>
-            <w:vAlign w:val="center"/>
-          </w:tcPr>
-          <w:p>
-            <w:pPr>
-              <w:keepNext/>
-              <w:keepLines/>
-              <w:jc w:val="center"/>
-            </w:pPr>
-            <w:r>
-              <w:rPr>
-                <w:rFonts w:ascii="Times New Roman" w:cs="Times New Roman" w:eastAsia="Times New Roman" w:hAnsi="Times New Roman"/>
-                <w:b w:val="false"/>
-                <w:bCs w:val="false"/>
-                <w:sz w:val="16"/>
-                <w:szCs w:val="16"/>
-              </w:rPr>
-              <w:t xml:space="preserve">0.85 / 0.78</w:t>
-            </w:r>
-          </w:p>
-        </w:tc>
-      </w:tr>
-      <w:tr>
-        <w:trPr>
-          <w:cantSplit/>
-        </w:trPr>
-        <w:tc>
-          <w:tcPr>
-            <w:tcW w:type="dxa" w:w="2000"/>
-            <w:tcBorders>
-              <w:top w:val="none" w:color="FFFFFF" w:sz="0"/>
-              <w:left w:val="none" w:color="FFFFFF" w:sz="0"/>
-              <w:bottom w:val="none" w:color="FFFFFF" w:sz="0"/>
-              <w:right w:val="none" w:color="FFFFFF" w:sz="0"/>
-            </w:tcBorders>
-            <w:tcMar>
-              <w:top w:type="dxa" w:w="15"/>
-              <w:left w:type="dxa" w:w="35"/>
-              <w:bottom w:type="dxa" w:w="15"/>
-              <w:right w:type="dxa" w:w="35"/>
-            </w:tcMar>
-            <w:vAlign w:val="center"/>
-          </w:tcPr>
-          <w:p>
-            <w:pPr>
-              <w:keepNext/>
-              <w:keepLines/>
-              <w:jc w:val="left"/>
-            </w:pPr>
-            <w:r>
-              <w:rPr>
-                <w:rFonts w:ascii="Times New Roman" w:cs="Times New Roman" w:eastAsia="Times New Roman" w:hAnsi="Times New Roman"/>
-                <w:b w:val="false"/>
-                <w:bCs w:val="false"/>
-                <w:sz w:val="16"/>
-                <w:szCs w:val="16"/>
-              </w:rPr>
-              <w:t xml:space="preserve">NOCT 48 / 44 °C</w:t>
-            </w:r>
-          </w:p>
-        </w:tc>
-        <w:tc>
-          <w:tcPr>
-            <w:tcW w:type="dxa" w:w="1250"/>
-            <w:tcBorders>
-              <w:top w:val="none" w:color="FFFFFF" w:sz="0"/>
-              <w:left w:val="none" w:color="FFFFFF" w:sz="0"/>
-              <w:bottom w:val="none" w:color="FFFFFF" w:sz="0"/>
-              <w:right w:val="none" w:color="FFFFFF" w:sz="0"/>
-            </w:tcBorders>
-            <w:tcMar>
-              <w:top w:type="dxa" w:w="15"/>
-              <w:left w:type="dxa" w:w="35"/>
-              <w:bottom w:type="dxa" w:w="15"/>
-              <w:right w:type="dxa" w:w="35"/>
-            </w:tcMar>
-            <w:vAlign w:val="center"/>
-          </w:tcPr>
-          <w:p>
-            <w:pPr>
-              <w:keepNext/>
-              <w:keepLines/>
-              <w:jc w:val="center"/>
-            </w:pPr>
-            <w:r>
-              <w:rPr>
-                <w:rFonts w:ascii="Times New Roman" w:cs="Times New Roman" w:eastAsia="Times New Roman" w:hAnsi="Times New Roman"/>
-                <w:b w:val="false"/>
-                <w:bCs w:val="false"/>
-                <w:sz w:val="16"/>
-                <w:szCs w:val="16"/>
-              </w:rPr>
-              <w:t xml:space="preserve">−1.0 / +1.0</w:t>
-            </w:r>
-          </w:p>
-        </w:tc>
-        <w:tc>
-          <w:tcPr>
-            <w:tcW w:type="dxa" w:w="1115"/>
-            <w:tcBorders>
-              <w:top w:val="none" w:color="FFFFFF" w:sz="0"/>
-              <w:left w:val="none" w:color="FFFFFF" w:sz="0"/>
-              <w:bottom w:val="none" w:color="FFFFFF" w:sz="0"/>
-              <w:right w:val="none" w:color="FFFFFF" w:sz="0"/>
-            </w:tcBorders>
-            <w:tcMar>
-              <w:top w:type="dxa" w:w="15"/>
-              <w:left w:type="dxa" w:w="35"/>
-              <w:bottom w:type="dxa" w:w="15"/>
-              <w:right w:type="dxa" w:w="35"/>
-            </w:tcMar>
-            <w:vAlign w:val="center"/>
-          </w:tcPr>
-          <w:p>
-            <w:pPr>
-              <w:keepNext/>
-              <w:keepLines/>
-              <w:jc w:val="center"/>
-            </w:pPr>
-            <w:r>
-              <w:rPr>
-                <w:rFonts w:ascii="Times New Roman" w:cs="Times New Roman" w:eastAsia="Times New Roman" w:hAnsi="Times New Roman"/>
-                <w:b w:val="false"/>
-                <w:bCs w:val="false"/>
-                <w:sz w:val="16"/>
-                <w:szCs w:val="16"/>
-              </w:rPr>
-              <w:t xml:space="preserve">0.82 / 0.80</w:t>
-            </w:r>
-          </w:p>
-        </w:tc>
-      </w:tr>
-      <w:tr>
-        <w:trPr>
-          <w:cantSplit/>
-        </w:trPr>
-        <w:tc>
-          <w:tcPr>
-            <w:tcW w:type="dxa" w:w="2000"/>
-            <w:tcBorders>
-              <w:top w:val="none" w:color="FFFFFF" w:sz="0"/>
-              <w:left w:val="none" w:color="FFFFFF" w:sz="0"/>
-              <w:bottom w:val="none" w:color="FFFFFF" w:sz="0"/>
-              <w:right w:val="none" w:color="FFFFFF" w:sz="0"/>
-            </w:tcBorders>
-            <w:tcMar>
-              <w:top w:type="dxa" w:w="15"/>
-              <w:left w:type="dxa" w:w="35"/>
-              <w:bottom w:type="dxa" w:w="15"/>
-              <w:right w:type="dxa" w:w="35"/>
-            </w:tcMar>
-            <w:vAlign w:val="center"/>
-          </w:tcPr>
-          <w:p>
-            <w:pPr>
-              <w:keepNext/>
-              <w:keepLines/>
-              <w:jc w:val="left"/>
-            </w:pPr>
-            <w:r>
-              <w:rPr>
-                <w:rFonts w:ascii="Times New Roman" w:cs="Times New Roman" w:eastAsia="Times New Roman" w:hAnsi="Times New Roman"/>
-                <w:b w:val="false"/>
-                <w:bCs w:val="false"/>
-                <w:sz w:val="16"/>
-                <w:szCs w:val="16"/>
-              </w:rPr>
-              <w:t xml:space="preserve">Incidence-angle loss</w:t>
-            </w:r>
-          </w:p>
-        </w:tc>
-        <w:tc>
-          <w:tcPr>
-            <w:tcW w:type="dxa" w:w="1250"/>
-            <w:tcBorders>
-              <w:top w:val="none" w:color="FFFFFF" w:sz="0"/>
-              <w:left w:val="none" w:color="FFFFFF" w:sz="0"/>
-              <w:bottom w:val="none" w:color="FFFFFF" w:sz="0"/>
-              <w:right w:val="none" w:color="FFFFFF" w:sz="0"/>
-            </w:tcBorders>
-            <w:tcMar>
-              <w:top w:type="dxa" w:w="15"/>
-              <w:left w:type="dxa" w:w="35"/>
-              <w:bottom w:type="dxa" w:w="15"/>
-              <w:right w:type="dxa" w:w="35"/>
-            </w:tcMar>
-            <w:vAlign w:val="center"/>
-          </w:tcPr>
-          <w:p>
-            <w:pPr>
-              <w:keepNext/>
-              <w:keepLines/>
-              <w:jc w:val="center"/>
-            </w:pPr>
-            <w:r>
-              <w:rPr>
-                <w:rFonts w:ascii="Times New Roman" w:cs="Times New Roman" w:eastAsia="Times New Roman" w:hAnsi="Times New Roman"/>
-                <w:b w:val="false"/>
-                <w:bCs w:val="false"/>
-                <w:sz w:val="16"/>
-                <w:szCs w:val="16"/>
-              </w:rPr>
-              <w:t xml:space="preserve">−1.8</w:t>
-            </w:r>
-          </w:p>
-        </w:tc>
-        <w:tc>
-          <w:tcPr>
-            <w:tcW w:type="dxa" w:w="1115"/>
-            <w:tcBorders>
-              <w:top w:val="none" w:color="FFFFFF" w:sz="0"/>
-              <w:left w:val="none" w:color="FFFFFF" w:sz="0"/>
-              <w:bottom w:val="none" w:color="FFFFFF" w:sz="0"/>
-              <w:right w:val="none" w:color="FFFFFF" w:sz="0"/>
-            </w:tcBorders>
-            <w:tcMar>
-              <w:top w:type="dxa" w:w="15"/>
-              <w:left w:type="dxa" w:w="35"/>
-              <w:bottom w:type="dxa" w:w="15"/>
-              <w:right w:type="dxa" w:w="35"/>
-            </w:tcMar>
-            <w:vAlign w:val="center"/>
-          </w:tcPr>
-          <w:p>
-            <w:pPr>
-              <w:keepNext/>
-              <w:keepLines/>
-              <w:jc w:val="center"/>
-            </w:pPr>
-            <w:r>
-              <w:rPr>
-                <w:rFonts w:ascii="Times New Roman" w:cs="Times New Roman" w:eastAsia="Times New Roman" w:hAnsi="Times New Roman"/>
-                <w:b w:val="false"/>
-                <w:bCs w:val="false"/>
-                <w:sz w:val="16"/>
-                <w:szCs w:val="16"/>
-              </w:rPr>
-              <w:t xml:space="preserve">0.82</w:t>
-            </w:r>
-          </w:p>
-        </w:tc>
-      </w:tr>
-      <w:tr>
-        <w:trPr>
-          <w:cantSplit/>
-        </w:trPr>
-        <w:tc>
-          <w:tcPr>
-            <w:tcW w:type="dxa" w:w="2000"/>
-            <w:tcBorders>
-              <w:top w:val="none" w:color="FFFFFF" w:sz="0"/>
-              <w:left w:val="none" w:color="FFFFFF" w:sz="0"/>
-              <w:bottom w:val="none" w:color="FFFFFF" w:sz="0"/>
-              <w:right w:val="none" w:color="FFFFFF" w:sz="0"/>
-            </w:tcBorders>
-            <w:tcMar>
-              <w:top w:type="dxa" w:w="15"/>
-              <w:left w:type="dxa" w:w="35"/>
-              <w:bottom w:type="dxa" w:w="15"/>
-              <w:right w:type="dxa" w:w="35"/>
-            </w:tcMar>
-            <w:vAlign w:val="center"/>
-          </w:tcPr>
-          <w:p>
-            <w:pPr>
-              <w:keepNext/>
-              <w:keepLines/>
-              <w:jc w:val="left"/>
-            </w:pPr>
-            <w:r>
-              <w:rPr>
-                <w:rFonts w:ascii="Times New Roman" w:cs="Times New Roman" w:eastAsia="Times New Roman" w:hAnsi="Times New Roman"/>
-                <w:b w:val="false"/>
-                <w:bCs w:val="false"/>
-                <w:sz w:val="16"/>
-                <w:szCs w:val="16"/>
-              </w:rPr>
-              <w:t xml:space="preserve">Isotropic transposition</w:t>
-            </w:r>
-          </w:p>
-        </w:tc>
-        <w:tc>
-          <w:tcPr>
-            <w:tcW w:type="dxa" w:w="1250"/>
-            <w:tcBorders>
-              <w:top w:val="none" w:color="FFFFFF" w:sz="0"/>
-              <w:left w:val="none" w:color="FFFFFF" w:sz="0"/>
-              <w:bottom w:val="none" w:color="FFFFFF" w:sz="0"/>
-              <w:right w:val="none" w:color="FFFFFF" w:sz="0"/>
-            </w:tcBorders>
-            <w:tcMar>
-              <w:top w:type="dxa" w:w="15"/>
-              <w:left w:type="dxa" w:w="35"/>
-              <w:bottom w:type="dxa" w:w="15"/>
-              <w:right w:type="dxa" w:w="35"/>
-            </w:tcMar>
-            <w:vAlign w:val="center"/>
-          </w:tcPr>
-          <w:p>
-            <w:pPr>
-              <w:keepNext/>
-              <w:keepLines/>
-              <w:jc w:val="center"/>
-            </w:pPr>
-            <w:r>
-              <w:rPr>
-                <w:rFonts w:ascii="Times New Roman" w:cs="Times New Roman" w:eastAsia="Times New Roman" w:hAnsi="Times New Roman"/>
-                <w:b w:val="false"/>
-                <w:bCs w:val="false"/>
-                <w:sz w:val="16"/>
-                <w:szCs w:val="16"/>
-              </w:rPr>
-              <w:t xml:space="preserve">−3.9</w:t>
-            </w:r>
-          </w:p>
-        </w:tc>
-        <w:tc>
-          <w:tcPr>
-            <w:tcW w:type="dxa" w:w="1115"/>
-            <w:tcBorders>
-              <w:top w:val="none" w:color="FFFFFF" w:sz="0"/>
-              <w:left w:val="none" w:color="FFFFFF" w:sz="0"/>
-              <w:bottom w:val="none" w:color="FFFFFF" w:sz="0"/>
-              <w:right w:val="none" w:color="FFFFFF" w:sz="0"/>
-            </w:tcBorders>
-            <w:tcMar>
-              <w:top w:type="dxa" w:w="15"/>
-              <w:left w:type="dxa" w:w="35"/>
-              <w:bottom w:type="dxa" w:w="15"/>
-              <w:right w:type="dxa" w:w="35"/>
-            </w:tcMar>
-            <w:vAlign w:val="center"/>
-          </w:tcPr>
-          <w:p>
-            <w:pPr>
-              <w:keepNext/>
-              <w:keepLines/>
-              <w:jc w:val="center"/>
-            </w:pPr>
-            <w:r>
-              <w:rPr>
-                <w:rFonts w:ascii="Times New Roman" w:cs="Times New Roman" w:eastAsia="Times New Roman" w:hAnsi="Times New Roman"/>
-                <w:b w:val="false"/>
-                <w:bCs w:val="false"/>
-                <w:sz w:val="16"/>
-                <w:szCs w:val="16"/>
-              </w:rPr>
-              <w:t xml:space="preserve">0.84</w:t>
-            </w:r>
-          </w:p>
-        </w:tc>
-      </w:tr>
-      <w:tr>
-        <w:trPr>
-          <w:cantSplit/>
-        </w:trPr>
-        <w:tc>
-          <w:tcPr>
-            <w:tcW w:type="dxa" w:w="2000"/>
-            <w:tcBorders>
-              <w:top w:val="none" w:color="FFFFFF" w:sz="0"/>
-              <w:left w:val="none" w:color="FFFFFF" w:sz="0"/>
-              <w:bottom w:val="single" w:color="000000" w:sz="8"/>
-              <w:right w:val="none" w:color="FFFFFF" w:sz="0"/>
-            </w:tcBorders>
-            <w:tcMar>
-              <w:top w:type="dxa" w:w="15"/>
-              <w:left w:type="dxa" w:w="35"/>
-              <w:bottom w:type="dxa" w:w="15"/>
-              <w:right w:type="dxa" w:w="35"/>
-            </w:tcMar>
-            <w:vAlign w:val="center"/>
-          </w:tcPr>
-          <w:p>
-            <w:pPr>
-              <w:keepNext w:val="false"/>
-              <w:keepLines/>
-              <w:jc w:val="left"/>
-            </w:pPr>
-            <w:r>
-              <w:rPr>
-                <w:rFonts w:ascii="Times New Roman" w:cs="Times New Roman" w:eastAsia="Times New Roman" w:hAnsi="Times New Roman"/>
-                <w:b w:val="false"/>
-                <w:bCs w:val="false"/>
-                <w:sz w:val="16"/>
-                <w:szCs w:val="16"/>
-              </w:rPr>
-              <w:t xml:space="preserve">Boland decomposition</w:t>
-            </w:r>
-          </w:p>
-        </w:tc>
-        <w:tc>
-          <w:tcPr>
-            <w:tcW w:type="dxa" w:w="1250"/>
-            <w:tcBorders>
-              <w:top w:val="none" w:color="FFFFFF" w:sz="0"/>
-              <w:left w:val="none" w:color="FFFFFF" w:sz="0"/>
-              <w:bottom w:val="single" w:color="000000" w:sz="8"/>
-              <w:right w:val="none" w:color="FFFFFF" w:sz="0"/>
-            </w:tcBorders>
-            <w:tcMar>
-              <w:top w:type="dxa" w:w="15"/>
-              <w:left w:type="dxa" w:w="35"/>
-              <w:bottom w:type="dxa" w:w="15"/>
-              <w:right w:type="dxa" w:w="35"/>
-            </w:tcMar>
-            <w:vAlign w:val="center"/>
-          </w:tcPr>
-          <w:p>
-            <w:pPr>
-              <w:keepNext w:val="false"/>
-              <w:keepLines/>
-              <w:jc w:val="center"/>
-            </w:pPr>
-            <w:r>
-              <w:rPr>
-                <w:rFonts w:ascii="Times New Roman" w:cs="Times New Roman" w:eastAsia="Times New Roman" w:hAnsi="Times New Roman"/>
-                <w:b w:val="false"/>
-                <w:bCs w:val="false"/>
-                <w:sz w:val="16"/>
-                <w:szCs w:val="16"/>
-              </w:rPr>
-              <w:t xml:space="preserve">−1.0</w:t>
-            </w:r>
-          </w:p>
-        </w:tc>
-        <w:tc>
-          <w:tcPr>
-            <w:tcW w:type="dxa" w:w="1115"/>
-            <w:tcBorders>
-              <w:top w:val="none" w:color="FFFFFF" w:sz="0"/>
-              <w:left w:val="none" w:color="FFFFFF" w:sz="0"/>
-              <w:bottom w:val="single" w:color="000000" w:sz="8"/>
-              <w:right w:val="none" w:color="FFFFFF" w:sz="0"/>
-            </w:tcBorders>
-            <w:tcMar>
-              <w:top w:type="dxa" w:w="15"/>
-              <w:left w:type="dxa" w:w="35"/>
-              <w:bottom w:type="dxa" w:w="15"/>
-              <w:right w:type="dxa" w:w="35"/>
-            </w:tcMar>
-            <w:vAlign w:val="center"/>
-          </w:tcPr>
-          <w:p>
-            <w:pPr>
-              <w:keepNext w:val="false"/>
-              <w:keepLines/>
-              <w:jc w:val="center"/>
-            </w:pPr>
-            <w:r>
-              <w:rPr>
-                <w:rFonts w:ascii="Times New Roman" w:cs="Times New Roman" w:eastAsia="Times New Roman" w:hAnsi="Times New Roman"/>
-                <w:b w:val="false"/>
-                <w:bCs w:val="false"/>
-                <w:sz w:val="16"/>
-                <w:szCs w:val="16"/>
-              </w:rPr>
-              <w:t xml:space="preserve">0.82</w:t>
-            </w:r>
-          </w:p>
-        </w:tc>
-      </w:tr>
-    </w:tbl>
-    <w:p>
-      <w:pPr>
-        <w:keepNext/>
-        <w:spacing w:after="0" w:before="60"/>
-        <w:jc w:val="center"/>
-      </w:pPr>
-      <w:r>
-        <w:drawing>
-          <wp:inline distT="0" distB="0" distL="0" distR="0">
-            <wp:extent cx="2743200" cy="2009775"/>
-            <wp:effectExtent t="0" r="0" b="0" l="0"/>
-            <wp:docPr id="10" name="fig_closure_rev.png" descr="Stacked lower bounds" title="Stacked lower bounds"/>
-            <wp:cNvGraphicFramePr>
-              <a:graphicFrameLocks xmlns:a="http://schemas.openxmlformats.org/drawingml/2006/main" noChangeAspect="1"/>
-            </wp:cNvGraphicFramePr>
-            <a:graphic xmlns:a="http://schemas.openxmlformats.org/drawingml/2006/main">
-              <a:graphicData uri="http://schemas.openxmlformats.org/drawingml/2006/picture">
-                <pic:pic xmlns:pic="http://schemas.openxmlformats.org/drawingml/2006/picture">
-                  <pic:nvPicPr>
-                    <pic:cNvPr id="0" name="" descr=""/>
-                    <pic:cNvPicPr>
-                      <a:picLocks noChangeAspect="1" noChangeArrowheads="1"/>
-                    </pic:cNvPicPr>
-                  </pic:nvPicPr>
-                  <pic:blipFill>
-                    <a:blip r:embed="rId22" cstate="none"/>
-                    <a:srcRect/>
-                    <a:stretch>
-                      <a:fillRect/>
-                    </a:stretch>
-                  </pic:blipFill>
-                  <pic:spPr bwMode="auto">
-                    <a:xfrm>
-                      <a:off x="0" y="0"/>
-                      <a:ext cx="2743200" cy="2009775"/>
-                    </a:xfrm>
-                    <a:prstGeom prst="rect">
-                      <a:avLst/>
-                    </a:prstGeom>
-                  </pic:spPr>
-                </pic:pic>
-              </a:graphicData>
-            </a:graphic>
-          </wp:inline>
-        </w:drawing>
-      </w:r>
-    </w:p>
-    <w:p>
-      <w:pPr>
-        <w:spacing w:after="120" w:before="40"/>
-        <w:jc w:val="both"/>
-      </w:pPr>
-      <w:r>
-        <w:rPr>
-          <w:rFonts w:ascii="Times New Roman" w:cs="Times New Roman" w:eastAsia="Times New Roman" w:hAnsi="Times New Roman"/>
-          <w:sz w:val="18"/>
-          <w:szCs w:val="18"/>
-        </w:rPr>
-        <w:t xml:space="preserve">Fig. 10 Modeled energy as a percentage of the baseline with the lower ends stacked; orange: options added in this revision; red line: measured.</w:t>
-      </w:r>
-    </w:p>
-    <w:p>
-      <w:pPr>
-        <w:keepNext/>
-        <w:spacing w:after="40" w:before="100"/>
-      </w:pPr>
-      <w:r>
-        <w:rPr>
-          <w:rFonts w:ascii="Times New Roman" w:cs="Times New Roman" w:eastAsia="Times New Roman" w:hAnsi="Times New Roman"/>
-          <w:b/>
-          <w:bCs/>
-          <w:sz w:val="20"/>
-          <w:szCs w:val="20"/>
-        </w:rPr>
-        <w:t xml:space="preserve">4.5 Long-term check with the inverter energy counters</w:t>
-      </w:r>
-    </w:p>
-    <w:p>
-      <w:pPr>
-        <w:spacing w:after="0" w:before="0" w:line="240"/>
-        <w:ind w:firstLine="400"/>
-        <w:jc w:val="both"/>
-      </w:pPr>
-      <w:r>
-        <w:rPr>
-          <w:rFonts w:ascii="Times New Roman" w:cs="Times New Roman" w:eastAsia="Times New Roman" w:hAnsi="Times New Roman"/>
-          <w:sz w:val="20"/>
-          <w:szCs w:val="20"/>
-        </w:rPr>
-        <w:t xml:space="preserve">The short records cover only a few days. A longer check is given by the lifetime energy counters of the inverters, read on 18 October 2026, 1280 days after commissioning on 17 April 2023: 269,093 kWh for the left and 264,693 kWh for the middle 50 kW inverter. The model with the as-built layout and 2023 weather, repeated for each calendar day of the same period, gives 267.0 and 257.7 MWh. The counters are thus 0.8% and 2.7% above the model (1411 and 1437 against 1399 kWh/kWp per year). The counter of the 30 kW inverter shows 3.6 GWh after 497,827 h, which is impossible, and was not used.</w:t>
-      </w:r>
-    </w:p>
-    <w:p>
-      <w:pPr>
-        <w:spacing w:after="0" w:before="0" w:line="240"/>
-        <w:ind w:firstLine="400"/>
-        <w:jc w:val="both"/>
-      </w:pPr>
-      <w:r>
-        <w:rPr>
-          <w:rFonts w:ascii="Times New Roman" w:cs="Times New Roman" w:eastAsia="Times New Roman" w:hAnsi="Times New Roman"/>
-          <w:sz w:val="20"/>
-          <w:szCs w:val="20"/>
-        </w:rPr>
-        <w:t xml:space="preserve">This comparison has its own uncertainty: the counters are the inverters' own meters, which read 3% above the recorder on 18 October; the weather of 2024 to 2026 differs from 2023; module degradation is not modeled; and outages are included in the counters. Even so, a constant shortfall of 19% would have shown in 3.5 years of data. The clear-day bias is therefore not a permanent loss of the plant. Either the model is lower than the plant under other conditions, or the October days are atypical, or both. The short records, mostly from autumn and winter, do not show where the difference is made up; the only summer record (7 August 2025) gives 1.01.</w:t>
+        <w:t xml:space="preserve">The counters are the inverters' own meters (3% above the recorder on 18 October), the weather of 2024 to 2026 differs from 2023, and degradation is not modeled. Even so, a constant shortfall of 19% would have shown in 3.5 years of data, so the clear-day bias is not a permanent loss of the plant: either the model is lower than the plant under other conditions or the October days are atypical. The short records, mostly from autumn and winter, cannot show which; the only summer record (7 August 2025) gives 1.01.</w:t>
       </w:r>
     </w:p>
     <w:p>
@@ -8167,7 +6970,7 @@
           <w:sz w:val="20"/>
           <w:szCs w:val="20"/>
         </w:rPr>
-        <w:t xml:space="preserve">The nine-factor budget gives a 5th to 95th percentile range of −5.5% to +11.4% relative to the baseline. This range does not include the 19% shortfall measured on clear autumn days, and the budget reaches the measurement only at its joint extreme (Section 4.4). Over 3.5 years, on the other hand, the inverter counters agree with the model within 3%. The model is therefore suitable for an estimate of the annual energy at this site, with the uncertainty given by the budget, but not for hourly or daily prediction on clear days, where it overestimates the power by about 20%. An additional loss factor fitted to the clear days (0 to 20%) would raise the share of plant losses in the variance to about 62% and lower the share of the inverter formulation from 7% to 3%, but the counters do not support such a loss at annual scale, so it is not added to the budget.</w:t>
+        <w:t xml:space="preserve">The nine-factor budget gives a 5th to 95th percentile range of −5.5% to +11.4% relative to the baseline. This range does not include the 19% shortfall measured on clear autumn days, and the budget reaches the measurement only at its joint extreme (Section 4.4). Over 3.5 years, on the other hand, the inverter counters agree with the model within 3%. The model is therefore suitable for an estimate of the annual energy at this site, with the uncertainty given by the budget, but not for hourly or daily prediction on clear days, where it overestimates the power by about 20%.</w:t>
       </w:r>
     </w:p>
     <w:p>

</xml_diff>